<commit_message>
Harvest US Sports Camps long-tail (volleyball, soccer +); promote today's pending to approved+awaiting_review
</commit_message>
<xml_diff>
--- a/Parent_Coach_Playbook_Business_Plan.docx
+++ b/Parent_Coach_Playbook_Business_Plan.docx
@@ -2055,7 +2055,7 @@
         <w:pStyle w:val="ListParagraph"/>
         <w:numPr>
           <w:ilvl w:val="0"/>
-          <w:numId w:val="3"/>
+          <w:numId w:val="4"/>
         </w:numPr>
         <w:spacing w:after="80" w:line="280"/>
       </w:pPr>
@@ -2074,7 +2074,7 @@
         <w:pStyle w:val="ListParagraph"/>
         <w:numPr>
           <w:ilvl w:val="0"/>
-          <w:numId w:val="3"/>
+          <w:numId w:val="4"/>
         </w:numPr>
         <w:spacing w:after="80" w:line="280"/>
       </w:pPr>
@@ -2093,7 +2093,7 @@
         <w:pStyle w:val="ListParagraph"/>
         <w:numPr>
           <w:ilvl w:val="0"/>
-          <w:numId w:val="3"/>
+          <w:numId w:val="4"/>
         </w:numPr>
         <w:spacing w:after="80" w:line="280"/>
       </w:pPr>
@@ -9503,7 +9503,7 @@
         <w:pStyle w:val="ListParagraph"/>
         <w:numPr>
           <w:ilvl w:val="0"/>
-          <w:numId w:val="3"/>
+          <w:numId w:val="5"/>
         </w:numPr>
         <w:spacing w:after="80" w:line="280"/>
       </w:pPr>
@@ -9522,7 +9522,7 @@
         <w:pStyle w:val="ListParagraph"/>
         <w:numPr>
           <w:ilvl w:val="0"/>
-          <w:numId w:val="3"/>
+          <w:numId w:val="5"/>
         </w:numPr>
         <w:spacing w:after="80" w:line="280"/>
       </w:pPr>
@@ -9541,7 +9541,7 @@
         <w:pStyle w:val="ListParagraph"/>
         <w:numPr>
           <w:ilvl w:val="0"/>
-          <w:numId w:val="3"/>
+          <w:numId w:val="5"/>
         </w:numPr>
         <w:spacing w:after="80" w:line="280"/>
       </w:pPr>
@@ -10592,7 +10592,7 @@
         <w:pStyle w:val="ListParagraph"/>
         <w:numPr>
           <w:ilvl w:val="0"/>
-          <w:numId w:val="3"/>
+          <w:numId w:val="6"/>
         </w:numPr>
         <w:spacing w:after="80" w:line="280"/>
       </w:pPr>
@@ -10611,7 +10611,7 @@
         <w:pStyle w:val="ListParagraph"/>
         <w:numPr>
           <w:ilvl w:val="0"/>
-          <w:numId w:val="3"/>
+          <w:numId w:val="6"/>
         </w:numPr>
         <w:spacing w:after="80" w:line="280"/>
       </w:pPr>
@@ -10630,7 +10630,7 @@
         <w:pStyle w:val="ListParagraph"/>
         <w:numPr>
           <w:ilvl w:val="0"/>
-          <w:numId w:val="3"/>
+          <w:numId w:val="6"/>
         </w:numPr>
         <w:spacing w:after="80" w:line="280"/>
       </w:pPr>
@@ -14003,7 +14003,7 @@
         <w:pStyle w:val="ListParagraph"/>
         <w:numPr>
           <w:ilvl w:val="0"/>
-          <w:numId w:val="3"/>
+          <w:numId w:val="7"/>
         </w:numPr>
         <w:spacing w:after="80" w:line="280"/>
       </w:pPr>
@@ -14022,7 +14022,7 @@
         <w:pStyle w:val="ListParagraph"/>
         <w:numPr>
           <w:ilvl w:val="0"/>
-          <w:numId w:val="3"/>
+          <w:numId w:val="7"/>
         </w:numPr>
         <w:spacing w:after="80" w:line="280"/>
       </w:pPr>
@@ -14041,7 +14041,7 @@
         <w:pStyle w:val="ListParagraph"/>
         <w:numPr>
           <w:ilvl w:val="0"/>
-          <w:numId w:val="3"/>
+          <w:numId w:val="7"/>
         </w:numPr>
         <w:spacing w:after="80" w:line="280"/>
       </w:pPr>
@@ -14060,7 +14060,7 @@
         <w:pStyle w:val="ListParagraph"/>
         <w:numPr>
           <w:ilvl w:val="0"/>
-          <w:numId w:val="3"/>
+          <w:numId w:val="7"/>
         </w:numPr>
         <w:spacing w:after="80" w:line="280"/>
       </w:pPr>
@@ -14079,7 +14079,7 @@
         <w:pStyle w:val="ListParagraph"/>
         <w:numPr>
           <w:ilvl w:val="0"/>
-          <w:numId w:val="3"/>
+          <w:numId w:val="7"/>
         </w:numPr>
         <w:spacing w:after="80" w:line="280"/>
       </w:pPr>
@@ -14234,7 +14234,7 @@
         <w:pStyle w:val="ListParagraph"/>
         <w:numPr>
           <w:ilvl w:val="0"/>
-          <w:numId w:val="3"/>
+          <w:numId w:val="8"/>
         </w:numPr>
         <w:spacing w:after="80" w:line="280"/>
       </w:pPr>
@@ -14253,7 +14253,7 @@
         <w:pStyle w:val="ListParagraph"/>
         <w:numPr>
           <w:ilvl w:val="0"/>
-          <w:numId w:val="3"/>
+          <w:numId w:val="8"/>
         </w:numPr>
         <w:spacing w:after="80" w:line="280"/>
       </w:pPr>
@@ -14272,7 +14272,7 @@
         <w:pStyle w:val="ListParagraph"/>
         <w:numPr>
           <w:ilvl w:val="0"/>
-          <w:numId w:val="3"/>
+          <w:numId w:val="8"/>
         </w:numPr>
         <w:spacing w:after="80" w:line="280"/>
       </w:pPr>
@@ -15569,7 +15569,7 @@
         <w:pStyle w:val="ListParagraph"/>
         <w:numPr>
           <w:ilvl w:val="0"/>
-          <w:numId w:val="3"/>
+          <w:numId w:val="9"/>
         </w:numPr>
         <w:spacing w:after="80" w:line="280"/>
       </w:pPr>
@@ -15588,7 +15588,7 @@
         <w:pStyle w:val="ListParagraph"/>
         <w:numPr>
           <w:ilvl w:val="0"/>
-          <w:numId w:val="3"/>
+          <w:numId w:val="9"/>
         </w:numPr>
         <w:spacing w:after="80" w:line="280"/>
       </w:pPr>
@@ -15607,7 +15607,7 @@
         <w:pStyle w:val="ListParagraph"/>
         <w:numPr>
           <w:ilvl w:val="0"/>
-          <w:numId w:val="3"/>
+          <w:numId w:val="9"/>
         </w:numPr>
         <w:spacing w:after="80" w:line="280"/>
       </w:pPr>
@@ -15626,7 +15626,7 @@
         <w:pStyle w:val="ListParagraph"/>
         <w:numPr>
           <w:ilvl w:val="0"/>
-          <w:numId w:val="3"/>
+          <w:numId w:val="9"/>
         </w:numPr>
         <w:spacing w:after="80" w:line="280"/>
       </w:pPr>
@@ -15645,7 +15645,7 @@
         <w:pStyle w:val="ListParagraph"/>
         <w:numPr>
           <w:ilvl w:val="0"/>
-          <w:numId w:val="3"/>
+          <w:numId w:val="9"/>
         </w:numPr>
         <w:spacing w:after="80" w:line="280"/>
       </w:pPr>
@@ -15664,7 +15664,7 @@
         <w:pStyle w:val="ListParagraph"/>
         <w:numPr>
           <w:ilvl w:val="0"/>
-          <w:numId w:val="3"/>
+          <w:numId w:val="9"/>
         </w:numPr>
         <w:spacing w:after="80" w:line="280"/>
       </w:pPr>
@@ -15692,7 +15692,7 @@
         <w:pStyle w:val="ListParagraph"/>
         <w:numPr>
           <w:ilvl w:val="0"/>
-          <w:numId w:val="3"/>
+          <w:numId w:val="10"/>
         </w:numPr>
         <w:spacing w:after="80" w:line="280"/>
       </w:pPr>
@@ -15711,7 +15711,7 @@
         <w:pStyle w:val="ListParagraph"/>
         <w:numPr>
           <w:ilvl w:val="0"/>
-          <w:numId w:val="3"/>
+          <w:numId w:val="10"/>
         </w:numPr>
         <w:spacing w:after="80" w:line="280"/>
       </w:pPr>
@@ -15730,7 +15730,7 @@
         <w:pStyle w:val="ListParagraph"/>
         <w:numPr>
           <w:ilvl w:val="0"/>
-          <w:numId w:val="3"/>
+          <w:numId w:val="10"/>
         </w:numPr>
         <w:spacing w:after="80" w:line="280"/>
       </w:pPr>
@@ -15758,7 +15758,7 @@
         <w:pStyle w:val="ListParagraph"/>
         <w:numPr>
           <w:ilvl w:val="0"/>
-          <w:numId w:val="3"/>
+          <w:numId w:val="11"/>
         </w:numPr>
         <w:spacing w:after="80" w:line="280"/>
       </w:pPr>
@@ -15777,7 +15777,7 @@
         <w:pStyle w:val="ListParagraph"/>
         <w:numPr>
           <w:ilvl w:val="0"/>
-          <w:numId w:val="3"/>
+          <w:numId w:val="11"/>
         </w:numPr>
         <w:spacing w:after="80" w:line="280"/>
       </w:pPr>
@@ -15796,7 +15796,7 @@
         <w:pStyle w:val="ListParagraph"/>
         <w:numPr>
           <w:ilvl w:val="0"/>
-          <w:numId w:val="3"/>
+          <w:numId w:val="11"/>
         </w:numPr>
         <w:spacing w:after="80" w:line="280"/>
       </w:pPr>
@@ -15824,7 +15824,7 @@
         <w:pStyle w:val="ListParagraph"/>
         <w:numPr>
           <w:ilvl w:val="0"/>
-          <w:numId w:val="3"/>
+          <w:numId w:val="12"/>
         </w:numPr>
         <w:spacing w:after="80" w:line="280"/>
       </w:pPr>
@@ -15843,7 +15843,7 @@
         <w:pStyle w:val="ListParagraph"/>
         <w:numPr>
           <w:ilvl w:val="0"/>
-          <w:numId w:val="3"/>
+          <w:numId w:val="12"/>
         </w:numPr>
         <w:spacing w:after="80" w:line="280"/>
       </w:pPr>
@@ -15862,7 +15862,7 @@
         <w:pStyle w:val="ListParagraph"/>
         <w:numPr>
           <w:ilvl w:val="0"/>
-          <w:numId w:val="3"/>
+          <w:numId w:val="12"/>
         </w:numPr>
         <w:spacing w:after="80" w:line="280"/>
       </w:pPr>
@@ -15890,7 +15890,7 @@
         <w:pStyle w:val="ListParagraph"/>
         <w:numPr>
           <w:ilvl w:val="0"/>
-          <w:numId w:val="3"/>
+          <w:numId w:val="13"/>
         </w:numPr>
         <w:spacing w:after="80" w:line="280"/>
       </w:pPr>
@@ -15909,7 +15909,7 @@
         <w:pStyle w:val="ListParagraph"/>
         <w:numPr>
           <w:ilvl w:val="0"/>
-          <w:numId w:val="3"/>
+          <w:numId w:val="13"/>
         </w:numPr>
         <w:spacing w:after="80" w:line="280"/>
       </w:pPr>
@@ -15928,7 +15928,7 @@
         <w:pStyle w:val="ListParagraph"/>
         <w:numPr>
           <w:ilvl w:val="0"/>
-          <w:numId w:val="3"/>
+          <w:numId w:val="13"/>
         </w:numPr>
         <w:spacing w:after="80" w:line="280"/>
       </w:pPr>
@@ -16105,7 +16105,7 @@
         <w:pStyle w:val="ListParagraph"/>
         <w:numPr>
           <w:ilvl w:val="0"/>
-          <w:numId w:val="3"/>
+          <w:numId w:val="14"/>
         </w:numPr>
         <w:spacing w:after="80" w:line="280"/>
       </w:pPr>
@@ -16124,7 +16124,7 @@
         <w:pStyle w:val="ListParagraph"/>
         <w:numPr>
           <w:ilvl w:val="0"/>
-          <w:numId w:val="3"/>
+          <w:numId w:val="14"/>
         </w:numPr>
         <w:spacing w:after="80" w:line="280"/>
       </w:pPr>
@@ -16143,7 +16143,7 @@
         <w:pStyle w:val="ListParagraph"/>
         <w:numPr>
           <w:ilvl w:val="0"/>
-          <w:numId w:val="3"/>
+          <w:numId w:val="14"/>
         </w:numPr>
         <w:spacing w:after="80" w:line="280"/>
       </w:pPr>
@@ -16162,7 +16162,7 @@
         <w:pStyle w:val="ListParagraph"/>
         <w:numPr>
           <w:ilvl w:val="0"/>
-          <w:numId w:val="3"/>
+          <w:numId w:val="14"/>
         </w:numPr>
         <w:spacing w:after="80" w:line="280"/>
       </w:pPr>
@@ -16316,7 +16316,7 @@
         <w:pStyle w:val="ListParagraph"/>
         <w:numPr>
           <w:ilvl w:val="0"/>
-          <w:numId w:val="3"/>
+          <w:numId w:val="15"/>
         </w:numPr>
         <w:spacing w:after="80" w:line="280"/>
       </w:pPr>
@@ -16335,7 +16335,7 @@
         <w:pStyle w:val="ListParagraph"/>
         <w:numPr>
           <w:ilvl w:val="0"/>
-          <w:numId w:val="3"/>
+          <w:numId w:val="15"/>
         </w:numPr>
         <w:spacing w:after="80" w:line="280"/>
       </w:pPr>
@@ -16354,7 +16354,7 @@
         <w:pStyle w:val="ListParagraph"/>
         <w:numPr>
           <w:ilvl w:val="0"/>
-          <w:numId w:val="3"/>
+          <w:numId w:val="15"/>
         </w:numPr>
         <w:spacing w:after="80" w:line="280"/>
       </w:pPr>
@@ -16373,7 +16373,7 @@
         <w:pStyle w:val="ListParagraph"/>
         <w:numPr>
           <w:ilvl w:val="0"/>
-          <w:numId w:val="3"/>
+          <w:numId w:val="15"/>
         </w:numPr>
         <w:spacing w:after="80" w:line="280"/>
       </w:pPr>
@@ -16392,7 +16392,7 @@
         <w:pStyle w:val="ListParagraph"/>
         <w:numPr>
           <w:ilvl w:val="0"/>
-          <w:numId w:val="3"/>
+          <w:numId w:val="15"/>
         </w:numPr>
         <w:spacing w:after="80" w:line="280"/>
       </w:pPr>
@@ -16938,7 +16938,7 @@
         <w:pStyle w:val="ListParagraph"/>
         <w:numPr>
           <w:ilvl w:val="0"/>
-          <w:numId w:val="3"/>
+          <w:numId w:val="16"/>
         </w:numPr>
         <w:spacing w:after="80" w:line="280"/>
       </w:pPr>
@@ -16957,7 +16957,7 @@
         <w:pStyle w:val="ListParagraph"/>
         <w:numPr>
           <w:ilvl w:val="0"/>
-          <w:numId w:val="3"/>
+          <w:numId w:val="16"/>
         </w:numPr>
         <w:spacing w:after="80" w:line="280"/>
       </w:pPr>
@@ -16976,7 +16976,7 @@
         <w:pStyle w:val="ListParagraph"/>
         <w:numPr>
           <w:ilvl w:val="0"/>
-          <w:numId w:val="3"/>
+          <w:numId w:val="16"/>
         </w:numPr>
         <w:spacing w:after="80" w:line="280"/>
       </w:pPr>
@@ -17050,7 +17050,7 @@
         <w:pStyle w:val="ListParagraph"/>
         <w:numPr>
           <w:ilvl w:val="0"/>
-          <w:numId w:val="3"/>
+          <w:numId w:val="17"/>
         </w:numPr>
         <w:spacing w:after="80" w:line="280"/>
       </w:pPr>
@@ -17069,7 +17069,7 @@
         <w:pStyle w:val="ListParagraph"/>
         <w:numPr>
           <w:ilvl w:val="0"/>
-          <w:numId w:val="3"/>
+          <w:numId w:val="17"/>
         </w:numPr>
         <w:spacing w:after="80" w:line="280"/>
       </w:pPr>
@@ -17088,7 +17088,7 @@
         <w:pStyle w:val="ListParagraph"/>
         <w:numPr>
           <w:ilvl w:val="0"/>
-          <w:numId w:val="3"/>
+          <w:numId w:val="17"/>
         </w:numPr>
         <w:spacing w:after="80" w:line="280"/>
       </w:pPr>
@@ -17107,7 +17107,7 @@
         <w:pStyle w:val="ListParagraph"/>
         <w:numPr>
           <w:ilvl w:val="0"/>
-          <w:numId w:val="3"/>
+          <w:numId w:val="17"/>
         </w:numPr>
         <w:spacing w:after="80" w:line="280"/>
       </w:pPr>
@@ -17126,7 +17126,7 @@
         <w:pStyle w:val="ListParagraph"/>
         <w:numPr>
           <w:ilvl w:val="0"/>
-          <w:numId w:val="3"/>
+          <w:numId w:val="17"/>
         </w:numPr>
         <w:spacing w:after="80" w:line="280"/>
       </w:pPr>
@@ -21877,7 +21877,7 @@
         <w:pStyle w:val="ListParagraph"/>
         <w:numPr>
           <w:ilvl w:val="0"/>
-          <w:numId w:val="3"/>
+          <w:numId w:val="18"/>
         </w:numPr>
         <w:spacing w:after="80" w:line="280"/>
       </w:pPr>
@@ -21896,7 +21896,7 @@
         <w:pStyle w:val="ListParagraph"/>
         <w:numPr>
           <w:ilvl w:val="0"/>
-          <w:numId w:val="3"/>
+          <w:numId w:val="18"/>
         </w:numPr>
         <w:spacing w:after="80" w:line="280"/>
       </w:pPr>
@@ -21915,7 +21915,7 @@
         <w:pStyle w:val="ListParagraph"/>
         <w:numPr>
           <w:ilvl w:val="0"/>
-          <w:numId w:val="3"/>
+          <w:numId w:val="18"/>
         </w:numPr>
         <w:spacing w:after="80" w:line="280"/>
       </w:pPr>
@@ -23810,6 +23810,1710 @@
       </w:pPr>
     </w:lvl>
   </w:abstractNum>
+  <w:abstractNum w:abstractNumId="4" w15:restartNumberingAfterBreak="0">
+    <w:multiLevelType w:val="hybridMultilevel"/>
+    <w:lvl w:ilvl="0" w15:tentative="1">
+      <w:start w:val="1"/>
+      <w:numFmt w:val="decimal"/>
+      <w:lvlText w:val="%1."/>
+      <w:lvlJc w:val="left"/>
+      <w:pPr>
+        <w:ind w:left="720" w:hanging="360"/>
+      </w:pPr>
+    </w:lvl>
+  </w:abstractNum>
+  <w:abstractNum w:abstractNumId="5" w15:restartNumberingAfterBreak="0">
+    <w:multiLevelType w:val="hybridMultilevel"/>
+    <w:lvl w:ilvl="0" w15:tentative="1">
+      <w:start w:val="1"/>
+      <w:numFmt w:val="decimal"/>
+      <w:lvlText w:val="%1."/>
+      <w:lvlJc w:val="left"/>
+      <w:pPr>
+        <w:ind w:left="720" w:hanging="360"/>
+      </w:pPr>
+    </w:lvl>
+  </w:abstractNum>
+  <w:abstractNum w:abstractNumId="6" w15:restartNumberingAfterBreak="0">
+    <w:multiLevelType w:val="hybridMultilevel"/>
+    <w:lvl w:ilvl="0" w15:tentative="1">
+      <w:start w:val="1"/>
+      <w:numFmt w:val="decimal"/>
+      <w:lvlText w:val="%1."/>
+      <w:lvlJc w:val="left"/>
+      <w:pPr>
+        <w:ind w:left="720" w:hanging="360"/>
+      </w:pPr>
+    </w:lvl>
+  </w:abstractNum>
+  <w:abstractNum w:abstractNumId="7" w15:restartNumberingAfterBreak="0">
+    <w:multiLevelType w:val="hybridMultilevel"/>
+    <w:lvl w:ilvl="0" w15:tentative="1">
+      <w:start w:val="1"/>
+      <w:numFmt w:val="decimal"/>
+      <w:lvlText w:val="%1."/>
+      <w:lvlJc w:val="left"/>
+      <w:pPr>
+        <w:ind w:left="720" w:hanging="360"/>
+      </w:pPr>
+    </w:lvl>
+  </w:abstractNum>
+  <w:abstractNum w:abstractNumId="8" w15:restartNumberingAfterBreak="0">
+    <w:multiLevelType w:val="hybridMultilevel"/>
+    <w:lvl w:ilvl="0" w15:tentative="1">
+      <w:start w:val="1"/>
+      <w:numFmt w:val="decimal"/>
+      <w:lvlText w:val="%1."/>
+      <w:lvlJc w:val="left"/>
+      <w:pPr>
+        <w:ind w:left="720" w:hanging="360"/>
+      </w:pPr>
+    </w:lvl>
+  </w:abstractNum>
+  <w:abstractNum w:abstractNumId="9" w15:restartNumberingAfterBreak="0">
+    <w:multiLevelType w:val="hybridMultilevel"/>
+    <w:lvl w:ilvl="0" w15:tentative="1">
+      <w:start w:val="1"/>
+      <w:numFmt w:val="decimal"/>
+      <w:lvlText w:val="%1."/>
+      <w:lvlJc w:val="left"/>
+      <w:pPr>
+        <w:ind w:left="720" w:hanging="360"/>
+      </w:pPr>
+    </w:lvl>
+  </w:abstractNum>
+  <w:abstractNum w:abstractNumId="10" w15:restartNumberingAfterBreak="0">
+    <w:multiLevelType w:val="hybridMultilevel"/>
+    <w:lvl w:ilvl="0" w15:tentative="1">
+      <w:start w:val="1"/>
+      <w:numFmt w:val="decimal"/>
+      <w:lvlText w:val="%1."/>
+      <w:lvlJc w:val="left"/>
+      <w:pPr>
+        <w:ind w:left="720" w:hanging="360"/>
+      </w:pPr>
+    </w:lvl>
+  </w:abstractNum>
+  <w:abstractNum w:abstractNumId="11" w15:restartNumberingAfterBreak="0">
+    <w:multiLevelType w:val="hybridMultilevel"/>
+    <w:lvl w:ilvl="0" w15:tentative="1">
+      <w:start w:val="1"/>
+      <w:numFmt w:val="decimal"/>
+      <w:lvlText w:val="%1."/>
+      <w:lvlJc w:val="left"/>
+      <w:pPr>
+        <w:ind w:left="720" w:hanging="360"/>
+      </w:pPr>
+    </w:lvl>
+  </w:abstractNum>
+  <w:abstractNum w:abstractNumId="12" w15:restartNumberingAfterBreak="0">
+    <w:multiLevelType w:val="hybridMultilevel"/>
+    <w:lvl w:ilvl="0" w15:tentative="1">
+      <w:start w:val="1"/>
+      <w:numFmt w:val="decimal"/>
+      <w:lvlText w:val="%1."/>
+      <w:lvlJc w:val="left"/>
+      <w:pPr>
+        <w:ind w:left="720" w:hanging="360"/>
+      </w:pPr>
+    </w:lvl>
+  </w:abstractNum>
+  <w:abstractNum w:abstractNumId="13" w15:restartNumberingAfterBreak="0">
+    <w:multiLevelType w:val="hybridMultilevel"/>
+    <w:lvl w:ilvl="0" w15:tentative="1">
+      <w:start w:val="1"/>
+      <w:numFmt w:val="decimal"/>
+      <w:lvlText w:val="%1."/>
+      <w:lvlJc w:val="left"/>
+      <w:pPr>
+        <w:ind w:left="720" w:hanging="360"/>
+      </w:pPr>
+    </w:lvl>
+  </w:abstractNum>
+  <w:abstractNum w:abstractNumId="14" w15:restartNumberingAfterBreak="0">
+    <w:multiLevelType w:val="hybridMultilevel"/>
+    <w:lvl w:ilvl="0" w15:tentative="1">
+      <w:start w:val="1"/>
+      <w:numFmt w:val="decimal"/>
+      <w:lvlText w:val="%1."/>
+      <w:lvlJc w:val="left"/>
+      <w:pPr>
+        <w:ind w:left="720" w:hanging="360"/>
+      </w:pPr>
+    </w:lvl>
+  </w:abstractNum>
+  <w:abstractNum w:abstractNumId="15" w15:restartNumberingAfterBreak="0">
+    <w:multiLevelType w:val="hybridMultilevel"/>
+    <w:lvl w:ilvl="0" w15:tentative="1">
+      <w:start w:val="1"/>
+      <w:numFmt w:val="decimal"/>
+      <w:lvlText w:val="%1."/>
+      <w:lvlJc w:val="left"/>
+      <w:pPr>
+        <w:ind w:left="720" w:hanging="360"/>
+      </w:pPr>
+    </w:lvl>
+  </w:abstractNum>
+  <w:abstractNum w:abstractNumId="16" w15:restartNumberingAfterBreak="0">
+    <w:multiLevelType w:val="hybridMultilevel"/>
+    <w:lvl w:ilvl="0" w15:tentative="1">
+      <w:start w:val="1"/>
+      <w:numFmt w:val="decimal"/>
+      <w:lvlText w:val="%1."/>
+      <w:lvlJc w:val="left"/>
+      <w:pPr>
+        <w:ind w:left="720" w:hanging="360"/>
+      </w:pPr>
+    </w:lvl>
+  </w:abstractNum>
+  <w:abstractNum w:abstractNumId="17" w15:restartNumberingAfterBreak="0">
+    <w:multiLevelType w:val="hybridMultilevel"/>
+    <w:lvl w:ilvl="0" w15:tentative="1">
+      <w:start w:val="1"/>
+      <w:numFmt w:val="decimal"/>
+      <w:lvlText w:val="%1."/>
+      <w:lvlJc w:val="left"/>
+      <w:pPr>
+        <w:ind w:left="720" w:hanging="360"/>
+      </w:pPr>
+    </w:lvl>
+  </w:abstractNum>
+  <w:abstractNum w:abstractNumId="18" w15:restartNumberingAfterBreak="0">
+    <w:multiLevelType w:val="hybridMultilevel"/>
+    <w:lvl w:ilvl="0" w15:tentative="1">
+      <w:start w:val="1"/>
+      <w:numFmt w:val="decimal"/>
+      <w:lvlText w:val="%1."/>
+      <w:lvlJc w:val="left"/>
+      <w:pPr>
+        <w:ind w:left="720" w:hanging="360"/>
+      </w:pPr>
+    </w:lvl>
+  </w:abstractNum>
+  <w:abstractNum w:abstractNumId="19" w15:restartNumberingAfterBreak="0">
+    <w:multiLevelType w:val="hybridMultilevel"/>
+    <w:lvl w:ilvl="0" w15:tentative="1">
+      <w:start w:val="1"/>
+      <w:numFmt w:val="decimal"/>
+      <w:lvlText w:val="%1."/>
+      <w:lvlJc w:val="left"/>
+      <w:pPr>
+        <w:ind w:left="720" w:hanging="360"/>
+      </w:pPr>
+    </w:lvl>
+  </w:abstractNum>
+  <w:abstractNum w:abstractNumId="20" w15:restartNumberingAfterBreak="0">
+    <w:multiLevelType w:val="hybridMultilevel"/>
+    <w:lvl w:ilvl="0" w15:tentative="1">
+      <w:start w:val="1"/>
+      <w:numFmt w:val="decimal"/>
+      <w:lvlText w:val="%1."/>
+      <w:lvlJc w:val="left"/>
+      <w:pPr>
+        <w:ind w:left="720" w:hanging="360"/>
+      </w:pPr>
+    </w:lvl>
+  </w:abstractNum>
+  <w:abstractNum w:abstractNumId="21" w15:restartNumberingAfterBreak="0">
+    <w:multiLevelType w:val="hybridMultilevel"/>
+    <w:lvl w:ilvl="0" w15:tentative="1">
+      <w:start w:val="1"/>
+      <w:numFmt w:val="decimal"/>
+      <w:lvlText w:val="%1."/>
+      <w:lvlJc w:val="left"/>
+      <w:pPr>
+        <w:ind w:left="720" w:hanging="360"/>
+      </w:pPr>
+    </w:lvl>
+  </w:abstractNum>
+  <w:abstractNum w:abstractNumId="22" w15:restartNumberingAfterBreak="0">
+    <w:multiLevelType w:val="hybridMultilevel"/>
+    <w:lvl w:ilvl="0" w15:tentative="1">
+      <w:start w:val="1"/>
+      <w:numFmt w:val="decimal"/>
+      <w:lvlText w:val="%1."/>
+      <w:lvlJc w:val="left"/>
+      <w:pPr>
+        <w:ind w:left="720" w:hanging="360"/>
+      </w:pPr>
+    </w:lvl>
+  </w:abstractNum>
+  <w:abstractNum w:abstractNumId="23" w15:restartNumberingAfterBreak="0">
+    <w:multiLevelType w:val="hybridMultilevel"/>
+    <w:lvl w:ilvl="0" w15:tentative="1">
+      <w:start w:val="1"/>
+      <w:numFmt w:val="decimal"/>
+      <w:lvlText w:val="%1."/>
+      <w:lvlJc w:val="left"/>
+      <w:pPr>
+        <w:ind w:left="720" w:hanging="360"/>
+      </w:pPr>
+    </w:lvl>
+  </w:abstractNum>
+  <w:abstractNum w:abstractNumId="24" w15:restartNumberingAfterBreak="0">
+    <w:multiLevelType w:val="hybridMultilevel"/>
+    <w:lvl w:ilvl="0" w15:tentative="1">
+      <w:start w:val="1"/>
+      <w:numFmt w:val="decimal"/>
+      <w:lvlText w:val="%1."/>
+      <w:lvlJc w:val="left"/>
+      <w:pPr>
+        <w:ind w:left="720" w:hanging="360"/>
+      </w:pPr>
+    </w:lvl>
+  </w:abstractNum>
+  <w:abstractNum w:abstractNumId="25" w15:restartNumberingAfterBreak="0">
+    <w:multiLevelType w:val="hybridMultilevel"/>
+    <w:lvl w:ilvl="0" w15:tentative="1">
+      <w:start w:val="1"/>
+      <w:numFmt w:val="decimal"/>
+      <w:lvlText w:val="%1."/>
+      <w:lvlJc w:val="left"/>
+      <w:pPr>
+        <w:ind w:left="720" w:hanging="360"/>
+      </w:pPr>
+    </w:lvl>
+  </w:abstractNum>
+  <w:abstractNum w:abstractNumId="26" w15:restartNumberingAfterBreak="0">
+    <w:multiLevelType w:val="hybridMultilevel"/>
+    <w:lvl w:ilvl="0" w15:tentative="1">
+      <w:start w:val="1"/>
+      <w:numFmt w:val="decimal"/>
+      <w:lvlText w:val="%1."/>
+      <w:lvlJc w:val="left"/>
+      <w:pPr>
+        <w:ind w:left="720" w:hanging="360"/>
+      </w:pPr>
+    </w:lvl>
+  </w:abstractNum>
+  <w:abstractNum w:abstractNumId="27" w15:restartNumberingAfterBreak="0">
+    <w:multiLevelType w:val="hybridMultilevel"/>
+    <w:lvl w:ilvl="0" w15:tentative="1">
+      <w:start w:val="1"/>
+      <w:numFmt w:val="decimal"/>
+      <w:lvlText w:val="%1."/>
+      <w:lvlJc w:val="left"/>
+      <w:pPr>
+        <w:ind w:left="720" w:hanging="360"/>
+      </w:pPr>
+    </w:lvl>
+  </w:abstractNum>
+  <w:abstractNum w:abstractNumId="28" w15:restartNumberingAfterBreak="0">
+    <w:multiLevelType w:val="hybridMultilevel"/>
+    <w:lvl w:ilvl="0" w15:tentative="1">
+      <w:start w:val="1"/>
+      <w:numFmt w:val="decimal"/>
+      <w:lvlText w:val="%1."/>
+      <w:lvlJc w:val="left"/>
+      <w:pPr>
+        <w:ind w:left="720" w:hanging="360"/>
+      </w:pPr>
+    </w:lvl>
+  </w:abstractNum>
+  <w:abstractNum w:abstractNumId="29" w15:restartNumberingAfterBreak="0">
+    <w:multiLevelType w:val="hybridMultilevel"/>
+    <w:lvl w:ilvl="0" w15:tentative="1">
+      <w:start w:val="1"/>
+      <w:numFmt w:val="decimal"/>
+      <w:lvlText w:val="%1."/>
+      <w:lvlJc w:val="left"/>
+      <w:pPr>
+        <w:ind w:left="720" w:hanging="360"/>
+      </w:pPr>
+    </w:lvl>
+  </w:abstractNum>
+  <w:abstractNum w:abstractNumId="30" w15:restartNumberingAfterBreak="0">
+    <w:multiLevelType w:val="hybridMultilevel"/>
+    <w:lvl w:ilvl="0" w15:tentative="1">
+      <w:start w:val="1"/>
+      <w:numFmt w:val="decimal"/>
+      <w:lvlText w:val="%1."/>
+      <w:lvlJc w:val="left"/>
+      <w:pPr>
+        <w:ind w:left="720" w:hanging="360"/>
+      </w:pPr>
+    </w:lvl>
+  </w:abstractNum>
+  <w:abstractNum w:abstractNumId="31" w15:restartNumberingAfterBreak="0">
+    <w:multiLevelType w:val="hybridMultilevel"/>
+    <w:lvl w:ilvl="0" w15:tentative="1">
+      <w:start w:val="1"/>
+      <w:numFmt w:val="decimal"/>
+      <w:lvlText w:val="%1."/>
+      <w:lvlJc w:val="left"/>
+      <w:pPr>
+        <w:ind w:left="720" w:hanging="360"/>
+      </w:pPr>
+    </w:lvl>
+  </w:abstractNum>
+  <w:abstractNum w:abstractNumId="32" w15:restartNumberingAfterBreak="0">
+    <w:multiLevelType w:val="hybridMultilevel"/>
+    <w:lvl w:ilvl="0" w15:tentative="1">
+      <w:start w:val="1"/>
+      <w:numFmt w:val="decimal"/>
+      <w:lvlText w:val="%1."/>
+      <w:lvlJc w:val="left"/>
+      <w:pPr>
+        <w:ind w:left="720" w:hanging="360"/>
+      </w:pPr>
+    </w:lvl>
+  </w:abstractNum>
+  <w:abstractNum w:abstractNumId="33" w15:restartNumberingAfterBreak="0">
+    <w:multiLevelType w:val="hybridMultilevel"/>
+    <w:lvl w:ilvl="0" w15:tentative="1">
+      <w:start w:val="1"/>
+      <w:numFmt w:val="decimal"/>
+      <w:lvlText w:val="%1."/>
+      <w:lvlJc w:val="left"/>
+      <w:pPr>
+        <w:ind w:left="720" w:hanging="360"/>
+      </w:pPr>
+    </w:lvl>
+  </w:abstractNum>
+  <w:abstractNum w:abstractNumId="34" w15:restartNumberingAfterBreak="0">
+    <w:multiLevelType w:val="hybridMultilevel"/>
+    <w:lvl w:ilvl="0" w15:tentative="1">
+      <w:start w:val="1"/>
+      <w:numFmt w:val="decimal"/>
+      <w:lvlText w:val="%1."/>
+      <w:lvlJc w:val="left"/>
+      <w:pPr>
+        <w:ind w:left="720" w:hanging="360"/>
+      </w:pPr>
+    </w:lvl>
+  </w:abstractNum>
+  <w:abstractNum w:abstractNumId="35" w15:restartNumberingAfterBreak="0">
+    <w:multiLevelType w:val="hybridMultilevel"/>
+    <w:lvl w:ilvl="0" w15:tentative="1">
+      <w:start w:val="1"/>
+      <w:numFmt w:val="decimal"/>
+      <w:lvlText w:val="%1."/>
+      <w:lvlJc w:val="left"/>
+      <w:pPr>
+        <w:ind w:left="720" w:hanging="360"/>
+      </w:pPr>
+    </w:lvl>
+  </w:abstractNum>
+  <w:abstractNum w:abstractNumId="36" w15:restartNumberingAfterBreak="0">
+    <w:multiLevelType w:val="hybridMultilevel"/>
+    <w:lvl w:ilvl="0" w15:tentative="1">
+      <w:start w:val="1"/>
+      <w:numFmt w:val="decimal"/>
+      <w:lvlText w:val="%1."/>
+      <w:lvlJc w:val="left"/>
+      <w:pPr>
+        <w:ind w:left="720" w:hanging="360"/>
+      </w:pPr>
+    </w:lvl>
+  </w:abstractNum>
+  <w:abstractNum w:abstractNumId="37" w15:restartNumberingAfterBreak="0">
+    <w:multiLevelType w:val="hybridMultilevel"/>
+    <w:lvl w:ilvl="0" w15:tentative="1">
+      <w:start w:val="1"/>
+      <w:numFmt w:val="decimal"/>
+      <w:lvlText w:val="%1."/>
+      <w:lvlJc w:val="left"/>
+      <w:pPr>
+        <w:ind w:left="720" w:hanging="360"/>
+      </w:pPr>
+    </w:lvl>
+  </w:abstractNum>
+  <w:abstractNum w:abstractNumId="38" w15:restartNumberingAfterBreak="0">
+    <w:multiLevelType w:val="hybridMultilevel"/>
+    <w:lvl w:ilvl="0" w15:tentative="1">
+      <w:start w:val="1"/>
+      <w:numFmt w:val="decimal"/>
+      <w:lvlText w:val="%1."/>
+      <w:lvlJc w:val="left"/>
+      <w:pPr>
+        <w:ind w:left="720" w:hanging="360"/>
+      </w:pPr>
+    </w:lvl>
+  </w:abstractNum>
+  <w:abstractNum w:abstractNumId="39" w15:restartNumberingAfterBreak="0">
+    <w:multiLevelType w:val="hybridMultilevel"/>
+    <w:lvl w:ilvl="0" w15:tentative="1">
+      <w:start w:val="1"/>
+      <w:numFmt w:val="decimal"/>
+      <w:lvlText w:val="%1."/>
+      <w:lvlJc w:val="left"/>
+      <w:pPr>
+        <w:ind w:left="720" w:hanging="360"/>
+      </w:pPr>
+    </w:lvl>
+  </w:abstractNum>
+  <w:abstractNum w:abstractNumId="40" w15:restartNumberingAfterBreak="0">
+    <w:multiLevelType w:val="hybridMultilevel"/>
+    <w:lvl w:ilvl="0" w15:tentative="1">
+      <w:start w:val="1"/>
+      <w:numFmt w:val="decimal"/>
+      <w:lvlText w:val="%1."/>
+      <w:lvlJc w:val="left"/>
+      <w:pPr>
+        <w:ind w:left="720" w:hanging="360"/>
+      </w:pPr>
+    </w:lvl>
+  </w:abstractNum>
+  <w:abstractNum w:abstractNumId="41" w15:restartNumberingAfterBreak="0">
+    <w:multiLevelType w:val="hybridMultilevel"/>
+    <w:lvl w:ilvl="0" w15:tentative="1">
+      <w:start w:val="1"/>
+      <w:numFmt w:val="decimal"/>
+      <w:lvlText w:val="%1."/>
+      <w:lvlJc w:val="left"/>
+      <w:pPr>
+        <w:ind w:left="720" w:hanging="360"/>
+      </w:pPr>
+    </w:lvl>
+  </w:abstractNum>
+  <w:abstractNum w:abstractNumId="42" w15:restartNumberingAfterBreak="0">
+    <w:multiLevelType w:val="hybridMultilevel"/>
+    <w:lvl w:ilvl="0" w15:tentative="1">
+      <w:start w:val="1"/>
+      <w:numFmt w:val="decimal"/>
+      <w:lvlText w:val="%1."/>
+      <w:lvlJc w:val="left"/>
+      <w:pPr>
+        <w:ind w:left="720" w:hanging="360"/>
+      </w:pPr>
+    </w:lvl>
+  </w:abstractNum>
+  <w:abstractNum w:abstractNumId="43" w15:restartNumberingAfterBreak="0">
+    <w:multiLevelType w:val="hybridMultilevel"/>
+    <w:lvl w:ilvl="0" w15:tentative="1">
+      <w:start w:val="1"/>
+      <w:numFmt w:val="decimal"/>
+      <w:lvlText w:val="%1."/>
+      <w:lvlJc w:val="left"/>
+      <w:pPr>
+        <w:ind w:left="720" w:hanging="360"/>
+      </w:pPr>
+    </w:lvl>
+  </w:abstractNum>
+  <w:abstractNum w:abstractNumId="44" w15:restartNumberingAfterBreak="0">
+    <w:multiLevelType w:val="hybridMultilevel"/>
+    <w:lvl w:ilvl="0" w15:tentative="1">
+      <w:start w:val="1"/>
+      <w:numFmt w:val="decimal"/>
+      <w:lvlText w:val="%1."/>
+      <w:lvlJc w:val="left"/>
+      <w:pPr>
+        <w:ind w:left="720" w:hanging="360"/>
+      </w:pPr>
+    </w:lvl>
+  </w:abstractNum>
+  <w:abstractNum w:abstractNumId="45" w15:restartNumberingAfterBreak="0">
+    <w:multiLevelType w:val="hybridMultilevel"/>
+    <w:lvl w:ilvl="0" w15:tentative="1">
+      <w:start w:val="1"/>
+      <w:numFmt w:val="decimal"/>
+      <w:lvlText w:val="%1."/>
+      <w:lvlJc w:val="left"/>
+      <w:pPr>
+        <w:ind w:left="720" w:hanging="360"/>
+      </w:pPr>
+    </w:lvl>
+  </w:abstractNum>
+  <w:abstractNum w:abstractNumId="46" w15:restartNumberingAfterBreak="0">
+    <w:multiLevelType w:val="hybridMultilevel"/>
+    <w:lvl w:ilvl="0" w15:tentative="1">
+      <w:start w:val="1"/>
+      <w:numFmt w:val="decimal"/>
+      <w:lvlText w:val="%1."/>
+      <w:lvlJc w:val="left"/>
+      <w:pPr>
+        <w:ind w:left="720" w:hanging="360"/>
+      </w:pPr>
+    </w:lvl>
+  </w:abstractNum>
+  <w:abstractNum w:abstractNumId="47" w15:restartNumberingAfterBreak="0">
+    <w:multiLevelType w:val="hybridMultilevel"/>
+    <w:lvl w:ilvl="0" w15:tentative="1">
+      <w:start w:val="1"/>
+      <w:numFmt w:val="decimal"/>
+      <w:lvlText w:val="%1."/>
+      <w:lvlJc w:val="left"/>
+      <w:pPr>
+        <w:ind w:left="720" w:hanging="360"/>
+      </w:pPr>
+    </w:lvl>
+  </w:abstractNum>
+  <w:abstractNum w:abstractNumId="48" w15:restartNumberingAfterBreak="0">
+    <w:multiLevelType w:val="hybridMultilevel"/>
+    <w:lvl w:ilvl="0" w15:tentative="1">
+      <w:start w:val="1"/>
+      <w:numFmt w:val="decimal"/>
+      <w:lvlText w:val="%1."/>
+      <w:lvlJc w:val="left"/>
+      <w:pPr>
+        <w:ind w:left="720" w:hanging="360"/>
+      </w:pPr>
+    </w:lvl>
+  </w:abstractNum>
+  <w:abstractNum w:abstractNumId="49" w15:restartNumberingAfterBreak="0">
+    <w:multiLevelType w:val="hybridMultilevel"/>
+    <w:lvl w:ilvl="0" w15:tentative="1">
+      <w:start w:val="1"/>
+      <w:numFmt w:val="decimal"/>
+      <w:lvlText w:val="%1."/>
+      <w:lvlJc w:val="left"/>
+      <w:pPr>
+        <w:ind w:left="720" w:hanging="360"/>
+      </w:pPr>
+    </w:lvl>
+  </w:abstractNum>
+  <w:abstractNum w:abstractNumId="50" w15:restartNumberingAfterBreak="0">
+    <w:multiLevelType w:val="hybridMultilevel"/>
+    <w:lvl w:ilvl="0" w15:tentative="1">
+      <w:start w:val="1"/>
+      <w:numFmt w:val="decimal"/>
+      <w:lvlText w:val="%1."/>
+      <w:lvlJc w:val="left"/>
+      <w:pPr>
+        <w:ind w:left="720" w:hanging="360"/>
+      </w:pPr>
+    </w:lvl>
+  </w:abstractNum>
+  <w:abstractNum w:abstractNumId="51" w15:restartNumberingAfterBreak="0">
+    <w:multiLevelType w:val="hybridMultilevel"/>
+    <w:lvl w:ilvl="0" w15:tentative="1">
+      <w:start w:val="1"/>
+      <w:numFmt w:val="decimal"/>
+      <w:lvlText w:val="%1."/>
+      <w:lvlJc w:val="left"/>
+      <w:pPr>
+        <w:ind w:left="720" w:hanging="360"/>
+      </w:pPr>
+    </w:lvl>
+  </w:abstractNum>
+  <w:abstractNum w:abstractNumId="52" w15:restartNumberingAfterBreak="0">
+    <w:multiLevelType w:val="hybridMultilevel"/>
+    <w:lvl w:ilvl="0" w15:tentative="1">
+      <w:start w:val="1"/>
+      <w:numFmt w:val="decimal"/>
+      <w:lvlText w:val="%1."/>
+      <w:lvlJc w:val="left"/>
+      <w:pPr>
+        <w:ind w:left="720" w:hanging="360"/>
+      </w:pPr>
+    </w:lvl>
+  </w:abstractNum>
+  <w:abstractNum w:abstractNumId="53" w15:restartNumberingAfterBreak="0">
+    <w:multiLevelType w:val="hybridMultilevel"/>
+    <w:lvl w:ilvl="0" w15:tentative="1">
+      <w:start w:val="1"/>
+      <w:numFmt w:val="decimal"/>
+      <w:lvlText w:val="%1."/>
+      <w:lvlJc w:val="left"/>
+      <w:pPr>
+        <w:ind w:left="720" w:hanging="360"/>
+      </w:pPr>
+    </w:lvl>
+  </w:abstractNum>
+  <w:abstractNum w:abstractNumId="54" w15:restartNumberingAfterBreak="0">
+    <w:multiLevelType w:val="hybridMultilevel"/>
+    <w:lvl w:ilvl="0" w15:tentative="1">
+      <w:start w:val="1"/>
+      <w:numFmt w:val="decimal"/>
+      <w:lvlText w:val="%1."/>
+      <w:lvlJc w:val="left"/>
+      <w:pPr>
+        <w:ind w:left="720" w:hanging="360"/>
+      </w:pPr>
+    </w:lvl>
+  </w:abstractNum>
+  <w:abstractNum w:abstractNumId="55" w15:restartNumberingAfterBreak="0">
+    <w:multiLevelType w:val="hybridMultilevel"/>
+    <w:lvl w:ilvl="0" w15:tentative="1">
+      <w:start w:val="1"/>
+      <w:numFmt w:val="decimal"/>
+      <w:lvlText w:val="%1."/>
+      <w:lvlJc w:val="left"/>
+      <w:pPr>
+        <w:ind w:left="720" w:hanging="360"/>
+      </w:pPr>
+    </w:lvl>
+  </w:abstractNum>
+  <w:abstractNum w:abstractNumId="56" w15:restartNumberingAfterBreak="0">
+    <w:multiLevelType w:val="hybridMultilevel"/>
+    <w:lvl w:ilvl="0" w15:tentative="1">
+      <w:start w:val="1"/>
+      <w:numFmt w:val="decimal"/>
+      <w:lvlText w:val="%1."/>
+      <w:lvlJc w:val="left"/>
+      <w:pPr>
+        <w:ind w:left="720" w:hanging="360"/>
+      </w:pPr>
+    </w:lvl>
+  </w:abstractNum>
+  <w:abstractNum w:abstractNumId="57" w15:restartNumberingAfterBreak="0">
+    <w:multiLevelType w:val="hybridMultilevel"/>
+    <w:lvl w:ilvl="0" w15:tentative="1">
+      <w:start w:val="1"/>
+      <w:numFmt w:val="decimal"/>
+      <w:lvlText w:val="%1."/>
+      <w:lvlJc w:val="left"/>
+      <w:pPr>
+        <w:ind w:left="720" w:hanging="360"/>
+      </w:pPr>
+    </w:lvl>
+  </w:abstractNum>
+  <w:abstractNum w:abstractNumId="58" w15:restartNumberingAfterBreak="0">
+    <w:multiLevelType w:val="hybridMultilevel"/>
+    <w:lvl w:ilvl="0" w15:tentative="1">
+      <w:start w:val="1"/>
+      <w:numFmt w:val="decimal"/>
+      <w:lvlText w:val="%1."/>
+      <w:lvlJc w:val="left"/>
+      <w:pPr>
+        <w:ind w:left="720" w:hanging="360"/>
+      </w:pPr>
+    </w:lvl>
+  </w:abstractNum>
+  <w:abstractNum w:abstractNumId="59" w15:restartNumberingAfterBreak="0">
+    <w:multiLevelType w:val="hybridMultilevel"/>
+    <w:lvl w:ilvl="0" w15:tentative="1">
+      <w:start w:val="1"/>
+      <w:numFmt w:val="decimal"/>
+      <w:lvlText w:val="%1."/>
+      <w:lvlJc w:val="left"/>
+      <w:pPr>
+        <w:ind w:left="720" w:hanging="360"/>
+      </w:pPr>
+    </w:lvl>
+  </w:abstractNum>
+  <w:abstractNum w:abstractNumId="60" w15:restartNumberingAfterBreak="0">
+    <w:multiLevelType w:val="hybridMultilevel"/>
+    <w:lvl w:ilvl="0" w15:tentative="1">
+      <w:start w:val="1"/>
+      <w:numFmt w:val="decimal"/>
+      <w:lvlText w:val="%1."/>
+      <w:lvlJc w:val="left"/>
+      <w:pPr>
+        <w:ind w:left="720" w:hanging="360"/>
+      </w:pPr>
+    </w:lvl>
+  </w:abstractNum>
+  <w:abstractNum w:abstractNumId="61" w15:restartNumberingAfterBreak="0">
+    <w:multiLevelType w:val="hybridMultilevel"/>
+    <w:lvl w:ilvl="0" w15:tentative="1">
+      <w:start w:val="1"/>
+      <w:numFmt w:val="decimal"/>
+      <w:lvlText w:val="%1."/>
+      <w:lvlJc w:val="left"/>
+      <w:pPr>
+        <w:ind w:left="720" w:hanging="360"/>
+      </w:pPr>
+    </w:lvl>
+  </w:abstractNum>
+  <w:abstractNum w:abstractNumId="62" w15:restartNumberingAfterBreak="0">
+    <w:multiLevelType w:val="hybridMultilevel"/>
+    <w:lvl w:ilvl="0" w15:tentative="1">
+      <w:start w:val="1"/>
+      <w:numFmt w:val="decimal"/>
+      <w:lvlText w:val="%1."/>
+      <w:lvlJc w:val="left"/>
+      <w:pPr>
+        <w:ind w:left="720" w:hanging="360"/>
+      </w:pPr>
+    </w:lvl>
+  </w:abstractNum>
+  <w:abstractNum w:abstractNumId="63" w15:restartNumberingAfterBreak="0">
+    <w:multiLevelType w:val="hybridMultilevel"/>
+    <w:lvl w:ilvl="0" w15:tentative="1">
+      <w:start w:val="1"/>
+      <w:numFmt w:val="decimal"/>
+      <w:lvlText w:val="%1."/>
+      <w:lvlJc w:val="left"/>
+      <w:pPr>
+        <w:ind w:left="720" w:hanging="360"/>
+      </w:pPr>
+    </w:lvl>
+  </w:abstractNum>
+  <w:abstractNum w:abstractNumId="64" w15:restartNumberingAfterBreak="0">
+    <w:multiLevelType w:val="hybridMultilevel"/>
+    <w:lvl w:ilvl="0" w15:tentative="1">
+      <w:start w:val="1"/>
+      <w:numFmt w:val="decimal"/>
+      <w:lvlText w:val="%1."/>
+      <w:lvlJc w:val="left"/>
+      <w:pPr>
+        <w:ind w:left="720" w:hanging="360"/>
+      </w:pPr>
+    </w:lvl>
+  </w:abstractNum>
+  <w:abstractNum w:abstractNumId="65" w15:restartNumberingAfterBreak="0">
+    <w:multiLevelType w:val="hybridMultilevel"/>
+    <w:lvl w:ilvl="0" w15:tentative="1">
+      <w:start w:val="1"/>
+      <w:numFmt w:val="decimal"/>
+      <w:lvlText w:val="%1."/>
+      <w:lvlJc w:val="left"/>
+      <w:pPr>
+        <w:ind w:left="720" w:hanging="360"/>
+      </w:pPr>
+    </w:lvl>
+  </w:abstractNum>
+  <w:abstractNum w:abstractNumId="66" w15:restartNumberingAfterBreak="0">
+    <w:multiLevelType w:val="hybridMultilevel"/>
+    <w:lvl w:ilvl="0" w15:tentative="1">
+      <w:start w:val="1"/>
+      <w:numFmt w:val="decimal"/>
+      <w:lvlText w:val="%1."/>
+      <w:lvlJc w:val="left"/>
+      <w:pPr>
+        <w:ind w:left="720" w:hanging="360"/>
+      </w:pPr>
+    </w:lvl>
+  </w:abstractNum>
+  <w:abstractNum w:abstractNumId="67" w15:restartNumberingAfterBreak="0">
+    <w:multiLevelType w:val="hybridMultilevel"/>
+    <w:lvl w:ilvl="0" w15:tentative="1">
+      <w:start w:val="1"/>
+      <w:numFmt w:val="decimal"/>
+      <w:lvlText w:val="%1."/>
+      <w:lvlJc w:val="left"/>
+      <w:pPr>
+        <w:ind w:left="720" w:hanging="360"/>
+      </w:pPr>
+    </w:lvl>
+  </w:abstractNum>
+  <w:abstractNum w:abstractNumId="68" w15:restartNumberingAfterBreak="0">
+    <w:multiLevelType w:val="hybridMultilevel"/>
+    <w:lvl w:ilvl="0" w15:tentative="1">
+      <w:start w:val="1"/>
+      <w:numFmt w:val="decimal"/>
+      <w:lvlText w:val="%1."/>
+      <w:lvlJc w:val="left"/>
+      <w:pPr>
+        <w:ind w:left="720" w:hanging="360"/>
+      </w:pPr>
+    </w:lvl>
+  </w:abstractNum>
+  <w:abstractNum w:abstractNumId="69" w15:restartNumberingAfterBreak="0">
+    <w:multiLevelType w:val="hybridMultilevel"/>
+    <w:lvl w:ilvl="0" w15:tentative="1">
+      <w:start w:val="1"/>
+      <w:numFmt w:val="decimal"/>
+      <w:lvlText w:val="%1."/>
+      <w:lvlJc w:val="left"/>
+      <w:pPr>
+        <w:ind w:left="720" w:hanging="360"/>
+      </w:pPr>
+    </w:lvl>
+  </w:abstractNum>
+  <w:abstractNum w:abstractNumId="70" w15:restartNumberingAfterBreak="0">
+    <w:multiLevelType w:val="hybridMultilevel"/>
+    <w:lvl w:ilvl="0" w15:tentative="1">
+      <w:start w:val="1"/>
+      <w:numFmt w:val="decimal"/>
+      <w:lvlText w:val="%1."/>
+      <w:lvlJc w:val="left"/>
+      <w:pPr>
+        <w:ind w:left="720" w:hanging="360"/>
+      </w:pPr>
+    </w:lvl>
+  </w:abstractNum>
+  <w:abstractNum w:abstractNumId="71" w15:restartNumberingAfterBreak="0">
+    <w:multiLevelType w:val="hybridMultilevel"/>
+    <w:lvl w:ilvl="0" w15:tentative="1">
+      <w:start w:val="1"/>
+      <w:numFmt w:val="decimal"/>
+      <w:lvlText w:val="%1."/>
+      <w:lvlJc w:val="left"/>
+      <w:pPr>
+        <w:ind w:left="720" w:hanging="360"/>
+      </w:pPr>
+    </w:lvl>
+  </w:abstractNum>
+  <w:abstractNum w:abstractNumId="72" w15:restartNumberingAfterBreak="0">
+    <w:multiLevelType w:val="hybridMultilevel"/>
+    <w:lvl w:ilvl="0" w15:tentative="1">
+      <w:start w:val="1"/>
+      <w:numFmt w:val="decimal"/>
+      <w:lvlText w:val="%1."/>
+      <w:lvlJc w:val="left"/>
+      <w:pPr>
+        <w:ind w:left="720" w:hanging="360"/>
+      </w:pPr>
+    </w:lvl>
+  </w:abstractNum>
+  <w:abstractNum w:abstractNumId="73" w15:restartNumberingAfterBreak="0">
+    <w:multiLevelType w:val="hybridMultilevel"/>
+    <w:lvl w:ilvl="0" w15:tentative="1">
+      <w:start w:val="1"/>
+      <w:numFmt w:val="decimal"/>
+      <w:lvlText w:val="%1."/>
+      <w:lvlJc w:val="left"/>
+      <w:pPr>
+        <w:ind w:left="720" w:hanging="360"/>
+      </w:pPr>
+    </w:lvl>
+  </w:abstractNum>
+  <w:abstractNum w:abstractNumId="74" w15:restartNumberingAfterBreak="0">
+    <w:multiLevelType w:val="hybridMultilevel"/>
+    <w:lvl w:ilvl="0" w15:tentative="1">
+      <w:start w:val="1"/>
+      <w:numFmt w:val="decimal"/>
+      <w:lvlText w:val="%1."/>
+      <w:lvlJc w:val="left"/>
+      <w:pPr>
+        <w:ind w:left="720" w:hanging="360"/>
+      </w:pPr>
+    </w:lvl>
+  </w:abstractNum>
+  <w:abstractNum w:abstractNumId="75" w15:restartNumberingAfterBreak="0">
+    <w:multiLevelType w:val="hybridMultilevel"/>
+    <w:lvl w:ilvl="0" w15:tentative="1">
+      <w:start w:val="1"/>
+      <w:numFmt w:val="decimal"/>
+      <w:lvlText w:val="%1."/>
+      <w:lvlJc w:val="left"/>
+      <w:pPr>
+        <w:ind w:left="720" w:hanging="360"/>
+      </w:pPr>
+    </w:lvl>
+  </w:abstractNum>
+  <w:abstractNum w:abstractNumId="76" w15:restartNumberingAfterBreak="0">
+    <w:multiLevelType w:val="hybridMultilevel"/>
+    <w:lvl w:ilvl="0" w15:tentative="1">
+      <w:start w:val="1"/>
+      <w:numFmt w:val="decimal"/>
+      <w:lvlText w:val="%1."/>
+      <w:lvlJc w:val="left"/>
+      <w:pPr>
+        <w:ind w:left="720" w:hanging="360"/>
+      </w:pPr>
+    </w:lvl>
+  </w:abstractNum>
+  <w:abstractNum w:abstractNumId="77" w15:restartNumberingAfterBreak="0">
+    <w:multiLevelType w:val="hybridMultilevel"/>
+    <w:lvl w:ilvl="0" w15:tentative="1">
+      <w:start w:val="1"/>
+      <w:numFmt w:val="decimal"/>
+      <w:lvlText w:val="%1."/>
+      <w:lvlJc w:val="left"/>
+      <w:pPr>
+        <w:ind w:left="720" w:hanging="360"/>
+      </w:pPr>
+    </w:lvl>
+  </w:abstractNum>
+  <w:abstractNum w:abstractNumId="78" w15:restartNumberingAfterBreak="0">
+    <w:multiLevelType w:val="hybridMultilevel"/>
+    <w:lvl w:ilvl="0" w15:tentative="1">
+      <w:start w:val="1"/>
+      <w:numFmt w:val="decimal"/>
+      <w:lvlText w:val="%1."/>
+      <w:lvlJc w:val="left"/>
+      <w:pPr>
+        <w:ind w:left="720" w:hanging="360"/>
+      </w:pPr>
+    </w:lvl>
+  </w:abstractNum>
+  <w:abstractNum w:abstractNumId="79" w15:restartNumberingAfterBreak="0">
+    <w:multiLevelType w:val="hybridMultilevel"/>
+    <w:lvl w:ilvl="0" w15:tentative="1">
+      <w:start w:val="1"/>
+      <w:numFmt w:val="decimal"/>
+      <w:lvlText w:val="%1."/>
+      <w:lvlJc w:val="left"/>
+      <w:pPr>
+        <w:ind w:left="720" w:hanging="360"/>
+      </w:pPr>
+    </w:lvl>
+  </w:abstractNum>
+  <w:abstractNum w:abstractNumId="80" w15:restartNumberingAfterBreak="0">
+    <w:multiLevelType w:val="hybridMultilevel"/>
+    <w:lvl w:ilvl="0" w15:tentative="1">
+      <w:start w:val="1"/>
+      <w:numFmt w:val="decimal"/>
+      <w:lvlText w:val="%1."/>
+      <w:lvlJc w:val="left"/>
+      <w:pPr>
+        <w:ind w:left="720" w:hanging="360"/>
+      </w:pPr>
+    </w:lvl>
+  </w:abstractNum>
+  <w:abstractNum w:abstractNumId="81" w15:restartNumberingAfterBreak="0">
+    <w:multiLevelType w:val="hybridMultilevel"/>
+    <w:lvl w:ilvl="0" w15:tentative="1">
+      <w:start w:val="1"/>
+      <w:numFmt w:val="decimal"/>
+      <w:lvlText w:val="%1."/>
+      <w:lvlJc w:val="left"/>
+      <w:pPr>
+        <w:ind w:left="720" w:hanging="360"/>
+      </w:pPr>
+    </w:lvl>
+  </w:abstractNum>
+  <w:abstractNum w:abstractNumId="82" w15:restartNumberingAfterBreak="0">
+    <w:multiLevelType w:val="hybridMultilevel"/>
+    <w:lvl w:ilvl="0" w15:tentative="1">
+      <w:start w:val="1"/>
+      <w:numFmt w:val="decimal"/>
+      <w:lvlText w:val="%1."/>
+      <w:lvlJc w:val="left"/>
+      <w:pPr>
+        <w:ind w:left="720" w:hanging="360"/>
+      </w:pPr>
+    </w:lvl>
+  </w:abstractNum>
+  <w:abstractNum w:abstractNumId="83" w15:restartNumberingAfterBreak="0">
+    <w:multiLevelType w:val="hybridMultilevel"/>
+    <w:lvl w:ilvl="0" w15:tentative="1">
+      <w:start w:val="1"/>
+      <w:numFmt w:val="decimal"/>
+      <w:lvlText w:val="%1."/>
+      <w:lvlJc w:val="left"/>
+      <w:pPr>
+        <w:ind w:left="720" w:hanging="360"/>
+      </w:pPr>
+    </w:lvl>
+  </w:abstractNum>
+  <w:abstractNum w:abstractNumId="84" w15:restartNumberingAfterBreak="0">
+    <w:multiLevelType w:val="hybridMultilevel"/>
+    <w:lvl w:ilvl="0" w15:tentative="1">
+      <w:start w:val="1"/>
+      <w:numFmt w:val="decimal"/>
+      <w:lvlText w:val="%1."/>
+      <w:lvlJc w:val="left"/>
+      <w:pPr>
+        <w:ind w:left="720" w:hanging="360"/>
+      </w:pPr>
+    </w:lvl>
+  </w:abstractNum>
+  <w:abstractNum w:abstractNumId="85" w15:restartNumberingAfterBreak="0">
+    <w:multiLevelType w:val="hybridMultilevel"/>
+    <w:lvl w:ilvl="0" w15:tentative="1">
+      <w:start w:val="1"/>
+      <w:numFmt w:val="decimal"/>
+      <w:lvlText w:val="%1."/>
+      <w:lvlJc w:val="left"/>
+      <w:pPr>
+        <w:ind w:left="720" w:hanging="360"/>
+      </w:pPr>
+    </w:lvl>
+  </w:abstractNum>
+  <w:abstractNum w:abstractNumId="86" w15:restartNumberingAfterBreak="0">
+    <w:multiLevelType w:val="hybridMultilevel"/>
+    <w:lvl w:ilvl="0" w15:tentative="1">
+      <w:start w:val="1"/>
+      <w:numFmt w:val="decimal"/>
+      <w:lvlText w:val="%1."/>
+      <w:lvlJc w:val="left"/>
+      <w:pPr>
+        <w:ind w:left="720" w:hanging="360"/>
+      </w:pPr>
+    </w:lvl>
+  </w:abstractNum>
+  <w:abstractNum w:abstractNumId="87" w15:restartNumberingAfterBreak="0">
+    <w:multiLevelType w:val="hybridMultilevel"/>
+    <w:lvl w:ilvl="0" w15:tentative="1">
+      <w:start w:val="1"/>
+      <w:numFmt w:val="decimal"/>
+      <w:lvlText w:val="%1."/>
+      <w:lvlJc w:val="left"/>
+      <w:pPr>
+        <w:ind w:left="720" w:hanging="360"/>
+      </w:pPr>
+    </w:lvl>
+  </w:abstractNum>
+  <w:abstractNum w:abstractNumId="88" w15:restartNumberingAfterBreak="0">
+    <w:multiLevelType w:val="hybridMultilevel"/>
+    <w:lvl w:ilvl="0" w15:tentative="1">
+      <w:start w:val="1"/>
+      <w:numFmt w:val="decimal"/>
+      <w:lvlText w:val="%1."/>
+      <w:lvlJc w:val="left"/>
+      <w:pPr>
+        <w:ind w:left="720" w:hanging="360"/>
+      </w:pPr>
+    </w:lvl>
+  </w:abstractNum>
+  <w:abstractNum w:abstractNumId="89" w15:restartNumberingAfterBreak="0">
+    <w:multiLevelType w:val="hybridMultilevel"/>
+    <w:lvl w:ilvl="0" w15:tentative="1">
+      <w:start w:val="1"/>
+      <w:numFmt w:val="decimal"/>
+      <w:lvlText w:val="%1."/>
+      <w:lvlJc w:val="left"/>
+      <w:pPr>
+        <w:ind w:left="720" w:hanging="360"/>
+      </w:pPr>
+    </w:lvl>
+  </w:abstractNum>
+  <w:abstractNum w:abstractNumId="90" w15:restartNumberingAfterBreak="0">
+    <w:multiLevelType w:val="hybridMultilevel"/>
+    <w:lvl w:ilvl="0" w15:tentative="1">
+      <w:start w:val="1"/>
+      <w:numFmt w:val="decimal"/>
+      <w:lvlText w:val="%1."/>
+      <w:lvlJc w:val="left"/>
+      <w:pPr>
+        <w:ind w:left="720" w:hanging="360"/>
+      </w:pPr>
+    </w:lvl>
+  </w:abstractNum>
+  <w:abstractNum w:abstractNumId="91" w15:restartNumberingAfterBreak="0">
+    <w:multiLevelType w:val="hybridMultilevel"/>
+    <w:lvl w:ilvl="0" w15:tentative="1">
+      <w:start w:val="1"/>
+      <w:numFmt w:val="decimal"/>
+      <w:lvlText w:val="%1."/>
+      <w:lvlJc w:val="left"/>
+      <w:pPr>
+        <w:ind w:left="720" w:hanging="360"/>
+      </w:pPr>
+    </w:lvl>
+  </w:abstractNum>
+  <w:abstractNum w:abstractNumId="92" w15:restartNumberingAfterBreak="0">
+    <w:multiLevelType w:val="hybridMultilevel"/>
+    <w:lvl w:ilvl="0" w15:tentative="1">
+      <w:start w:val="1"/>
+      <w:numFmt w:val="decimal"/>
+      <w:lvlText w:val="%1."/>
+      <w:lvlJc w:val="left"/>
+      <w:pPr>
+        <w:ind w:left="720" w:hanging="360"/>
+      </w:pPr>
+    </w:lvl>
+  </w:abstractNum>
+  <w:abstractNum w:abstractNumId="93" w15:restartNumberingAfterBreak="0">
+    <w:multiLevelType w:val="hybridMultilevel"/>
+    <w:lvl w:ilvl="0" w15:tentative="1">
+      <w:start w:val="1"/>
+      <w:numFmt w:val="decimal"/>
+      <w:lvlText w:val="%1."/>
+      <w:lvlJc w:val="left"/>
+      <w:pPr>
+        <w:ind w:left="720" w:hanging="360"/>
+      </w:pPr>
+    </w:lvl>
+  </w:abstractNum>
+  <w:abstractNum w:abstractNumId="94" w15:restartNumberingAfterBreak="0">
+    <w:multiLevelType w:val="hybridMultilevel"/>
+    <w:lvl w:ilvl="0" w15:tentative="1">
+      <w:start w:val="1"/>
+      <w:numFmt w:val="decimal"/>
+      <w:lvlText w:val="%1."/>
+      <w:lvlJc w:val="left"/>
+      <w:pPr>
+        <w:ind w:left="720" w:hanging="360"/>
+      </w:pPr>
+    </w:lvl>
+  </w:abstractNum>
+  <w:abstractNum w:abstractNumId="95" w15:restartNumberingAfterBreak="0">
+    <w:multiLevelType w:val="hybridMultilevel"/>
+    <w:lvl w:ilvl="0" w15:tentative="1">
+      <w:start w:val="1"/>
+      <w:numFmt w:val="decimal"/>
+      <w:lvlText w:val="%1."/>
+      <w:lvlJc w:val="left"/>
+      <w:pPr>
+        <w:ind w:left="720" w:hanging="360"/>
+      </w:pPr>
+    </w:lvl>
+  </w:abstractNum>
+  <w:abstractNum w:abstractNumId="96" w15:restartNumberingAfterBreak="0">
+    <w:multiLevelType w:val="hybridMultilevel"/>
+    <w:lvl w:ilvl="0" w15:tentative="1">
+      <w:start w:val="1"/>
+      <w:numFmt w:val="decimal"/>
+      <w:lvlText w:val="%1."/>
+      <w:lvlJc w:val="left"/>
+      <w:pPr>
+        <w:ind w:left="720" w:hanging="360"/>
+      </w:pPr>
+    </w:lvl>
+  </w:abstractNum>
+  <w:abstractNum w:abstractNumId="97" w15:restartNumberingAfterBreak="0">
+    <w:multiLevelType w:val="hybridMultilevel"/>
+    <w:lvl w:ilvl="0" w15:tentative="1">
+      <w:start w:val="1"/>
+      <w:numFmt w:val="decimal"/>
+      <w:lvlText w:val="%1."/>
+      <w:lvlJc w:val="left"/>
+      <w:pPr>
+        <w:ind w:left="720" w:hanging="360"/>
+      </w:pPr>
+    </w:lvl>
+  </w:abstractNum>
+  <w:abstractNum w:abstractNumId="98" w15:restartNumberingAfterBreak="0">
+    <w:multiLevelType w:val="hybridMultilevel"/>
+    <w:lvl w:ilvl="0" w15:tentative="1">
+      <w:start w:val="1"/>
+      <w:numFmt w:val="decimal"/>
+      <w:lvlText w:val="%1."/>
+      <w:lvlJc w:val="left"/>
+      <w:pPr>
+        <w:ind w:left="720" w:hanging="360"/>
+      </w:pPr>
+    </w:lvl>
+  </w:abstractNum>
+  <w:abstractNum w:abstractNumId="99" w15:restartNumberingAfterBreak="0">
+    <w:multiLevelType w:val="hybridMultilevel"/>
+    <w:lvl w:ilvl="0" w15:tentative="1">
+      <w:start w:val="1"/>
+      <w:numFmt w:val="decimal"/>
+      <w:lvlText w:val="%1."/>
+      <w:lvlJc w:val="left"/>
+      <w:pPr>
+        <w:ind w:left="720" w:hanging="360"/>
+      </w:pPr>
+    </w:lvl>
+  </w:abstractNum>
+  <w:abstractNum w:abstractNumId="100" w15:restartNumberingAfterBreak="0">
+    <w:multiLevelType w:val="hybridMultilevel"/>
+    <w:lvl w:ilvl="0" w15:tentative="1">
+      <w:start w:val="1"/>
+      <w:numFmt w:val="decimal"/>
+      <w:lvlText w:val="%1."/>
+      <w:lvlJc w:val="left"/>
+      <w:pPr>
+        <w:ind w:left="720" w:hanging="360"/>
+      </w:pPr>
+    </w:lvl>
+  </w:abstractNum>
+  <w:abstractNum w:abstractNumId="101" w15:restartNumberingAfterBreak="0">
+    <w:multiLevelType w:val="hybridMultilevel"/>
+    <w:lvl w:ilvl="0" w15:tentative="1">
+      <w:start w:val="1"/>
+      <w:numFmt w:val="decimal"/>
+      <w:lvlText w:val="%1."/>
+      <w:lvlJc w:val="left"/>
+      <w:pPr>
+        <w:ind w:left="720" w:hanging="360"/>
+      </w:pPr>
+    </w:lvl>
+  </w:abstractNum>
+  <w:abstractNum w:abstractNumId="102" w15:restartNumberingAfterBreak="0">
+    <w:multiLevelType w:val="hybridMultilevel"/>
+    <w:lvl w:ilvl="0" w15:tentative="1">
+      <w:start w:val="1"/>
+      <w:numFmt w:val="decimal"/>
+      <w:lvlText w:val="%1."/>
+      <w:lvlJc w:val="left"/>
+      <w:pPr>
+        <w:ind w:left="720" w:hanging="360"/>
+      </w:pPr>
+    </w:lvl>
+  </w:abstractNum>
+  <w:abstractNum w:abstractNumId="103" w15:restartNumberingAfterBreak="0">
+    <w:multiLevelType w:val="hybridMultilevel"/>
+    <w:lvl w:ilvl="0" w15:tentative="1">
+      <w:start w:val="1"/>
+      <w:numFmt w:val="decimal"/>
+      <w:lvlText w:val="%1."/>
+      <w:lvlJc w:val="left"/>
+      <w:pPr>
+        <w:ind w:left="720" w:hanging="360"/>
+      </w:pPr>
+    </w:lvl>
+  </w:abstractNum>
+  <w:abstractNum w:abstractNumId="104" w15:restartNumberingAfterBreak="0">
+    <w:multiLevelType w:val="hybridMultilevel"/>
+    <w:lvl w:ilvl="0" w15:tentative="1">
+      <w:start w:val="1"/>
+      <w:numFmt w:val="decimal"/>
+      <w:lvlText w:val="%1."/>
+      <w:lvlJc w:val="left"/>
+      <w:pPr>
+        <w:ind w:left="720" w:hanging="360"/>
+      </w:pPr>
+    </w:lvl>
+  </w:abstractNum>
+  <w:abstractNum w:abstractNumId="105" w15:restartNumberingAfterBreak="0">
+    <w:multiLevelType w:val="hybridMultilevel"/>
+    <w:lvl w:ilvl="0" w15:tentative="1">
+      <w:start w:val="1"/>
+      <w:numFmt w:val="decimal"/>
+      <w:lvlText w:val="%1."/>
+      <w:lvlJc w:val="left"/>
+      <w:pPr>
+        <w:ind w:left="720" w:hanging="360"/>
+      </w:pPr>
+    </w:lvl>
+  </w:abstractNum>
+  <w:abstractNum w:abstractNumId="106" w15:restartNumberingAfterBreak="0">
+    <w:multiLevelType w:val="hybridMultilevel"/>
+    <w:lvl w:ilvl="0" w15:tentative="1">
+      <w:start w:val="1"/>
+      <w:numFmt w:val="decimal"/>
+      <w:lvlText w:val="%1."/>
+      <w:lvlJc w:val="left"/>
+      <w:pPr>
+        <w:ind w:left="720" w:hanging="360"/>
+      </w:pPr>
+    </w:lvl>
+  </w:abstractNum>
+  <w:abstractNum w:abstractNumId="107" w15:restartNumberingAfterBreak="0">
+    <w:multiLevelType w:val="hybridMultilevel"/>
+    <w:lvl w:ilvl="0" w15:tentative="1">
+      <w:start w:val="1"/>
+      <w:numFmt w:val="decimal"/>
+      <w:lvlText w:val="%1."/>
+      <w:lvlJc w:val="left"/>
+      <w:pPr>
+        <w:ind w:left="720" w:hanging="360"/>
+      </w:pPr>
+    </w:lvl>
+  </w:abstractNum>
+  <w:abstractNum w:abstractNumId="108" w15:restartNumberingAfterBreak="0">
+    <w:multiLevelType w:val="hybridMultilevel"/>
+    <w:lvl w:ilvl="0" w15:tentative="1">
+      <w:start w:val="1"/>
+      <w:numFmt w:val="decimal"/>
+      <w:lvlText w:val="%1."/>
+      <w:lvlJc w:val="left"/>
+      <w:pPr>
+        <w:ind w:left="720" w:hanging="360"/>
+      </w:pPr>
+    </w:lvl>
+  </w:abstractNum>
+  <w:abstractNum w:abstractNumId="109" w15:restartNumberingAfterBreak="0">
+    <w:multiLevelType w:val="hybridMultilevel"/>
+    <w:lvl w:ilvl="0" w15:tentative="1">
+      <w:start w:val="1"/>
+      <w:numFmt w:val="decimal"/>
+      <w:lvlText w:val="%1."/>
+      <w:lvlJc w:val="left"/>
+      <w:pPr>
+        <w:ind w:left="720" w:hanging="360"/>
+      </w:pPr>
+    </w:lvl>
+  </w:abstractNum>
+  <w:abstractNum w:abstractNumId="110" w15:restartNumberingAfterBreak="0">
+    <w:multiLevelType w:val="hybridMultilevel"/>
+    <w:lvl w:ilvl="0" w15:tentative="1">
+      <w:start w:val="1"/>
+      <w:numFmt w:val="decimal"/>
+      <w:lvlText w:val="%1."/>
+      <w:lvlJc w:val="left"/>
+      <w:pPr>
+        <w:ind w:left="720" w:hanging="360"/>
+      </w:pPr>
+    </w:lvl>
+  </w:abstractNum>
+  <w:abstractNum w:abstractNumId="111" w15:restartNumberingAfterBreak="0">
+    <w:multiLevelType w:val="hybridMultilevel"/>
+    <w:lvl w:ilvl="0" w15:tentative="1">
+      <w:start w:val="1"/>
+      <w:numFmt w:val="decimal"/>
+      <w:lvlText w:val="%1."/>
+      <w:lvlJc w:val="left"/>
+      <w:pPr>
+        <w:ind w:left="720" w:hanging="360"/>
+      </w:pPr>
+    </w:lvl>
+  </w:abstractNum>
+  <w:abstractNum w:abstractNumId="112" w15:restartNumberingAfterBreak="0">
+    <w:multiLevelType w:val="hybridMultilevel"/>
+    <w:lvl w:ilvl="0" w15:tentative="1">
+      <w:start w:val="1"/>
+      <w:numFmt w:val="decimal"/>
+      <w:lvlText w:val="%1."/>
+      <w:lvlJc w:val="left"/>
+      <w:pPr>
+        <w:ind w:left="720" w:hanging="360"/>
+      </w:pPr>
+    </w:lvl>
+  </w:abstractNum>
+  <w:abstractNum w:abstractNumId="113" w15:restartNumberingAfterBreak="0">
+    <w:multiLevelType w:val="hybridMultilevel"/>
+    <w:lvl w:ilvl="0" w15:tentative="1">
+      <w:start w:val="1"/>
+      <w:numFmt w:val="decimal"/>
+      <w:lvlText w:val="%1."/>
+      <w:lvlJc w:val="left"/>
+      <w:pPr>
+        <w:ind w:left="720" w:hanging="360"/>
+      </w:pPr>
+    </w:lvl>
+  </w:abstractNum>
+  <w:abstractNum w:abstractNumId="114" w15:restartNumberingAfterBreak="0">
+    <w:multiLevelType w:val="hybridMultilevel"/>
+    <w:lvl w:ilvl="0" w15:tentative="1">
+      <w:start w:val="1"/>
+      <w:numFmt w:val="decimal"/>
+      <w:lvlText w:val="%1."/>
+      <w:lvlJc w:val="left"/>
+      <w:pPr>
+        <w:ind w:left="720" w:hanging="360"/>
+      </w:pPr>
+    </w:lvl>
+  </w:abstractNum>
+  <w:abstractNum w:abstractNumId="115" w15:restartNumberingAfterBreak="0">
+    <w:multiLevelType w:val="hybridMultilevel"/>
+    <w:lvl w:ilvl="0" w15:tentative="1">
+      <w:start w:val="1"/>
+      <w:numFmt w:val="decimal"/>
+      <w:lvlText w:val="%1."/>
+      <w:lvlJc w:val="left"/>
+      <w:pPr>
+        <w:ind w:left="720" w:hanging="360"/>
+      </w:pPr>
+    </w:lvl>
+  </w:abstractNum>
+  <w:abstractNum w:abstractNumId="116" w15:restartNumberingAfterBreak="0">
+    <w:multiLevelType w:val="hybridMultilevel"/>
+    <w:lvl w:ilvl="0" w15:tentative="1">
+      <w:start w:val="1"/>
+      <w:numFmt w:val="decimal"/>
+      <w:lvlText w:val="%1."/>
+      <w:lvlJc w:val="left"/>
+      <w:pPr>
+        <w:ind w:left="720" w:hanging="360"/>
+      </w:pPr>
+    </w:lvl>
+  </w:abstractNum>
+  <w:abstractNum w:abstractNumId="117" w15:restartNumberingAfterBreak="0">
+    <w:multiLevelType w:val="hybridMultilevel"/>
+    <w:lvl w:ilvl="0" w15:tentative="1">
+      <w:start w:val="1"/>
+      <w:numFmt w:val="decimal"/>
+      <w:lvlText w:val="%1."/>
+      <w:lvlJc w:val="left"/>
+      <w:pPr>
+        <w:ind w:left="720" w:hanging="360"/>
+      </w:pPr>
+    </w:lvl>
+  </w:abstractNum>
+  <w:abstractNum w:abstractNumId="118" w15:restartNumberingAfterBreak="0">
+    <w:multiLevelType w:val="hybridMultilevel"/>
+    <w:lvl w:ilvl="0" w15:tentative="1">
+      <w:start w:val="1"/>
+      <w:numFmt w:val="decimal"/>
+      <w:lvlText w:val="%1."/>
+      <w:lvlJc w:val="left"/>
+      <w:pPr>
+        <w:ind w:left="720" w:hanging="360"/>
+      </w:pPr>
+    </w:lvl>
+  </w:abstractNum>
+  <w:abstractNum w:abstractNumId="119" w15:restartNumberingAfterBreak="0">
+    <w:multiLevelType w:val="hybridMultilevel"/>
+    <w:lvl w:ilvl="0" w15:tentative="1">
+      <w:start w:val="1"/>
+      <w:numFmt w:val="decimal"/>
+      <w:lvlText w:val="%1."/>
+      <w:lvlJc w:val="left"/>
+      <w:pPr>
+        <w:ind w:left="720" w:hanging="360"/>
+      </w:pPr>
+    </w:lvl>
+  </w:abstractNum>
+  <w:abstractNum w:abstractNumId="120" w15:restartNumberingAfterBreak="0">
+    <w:multiLevelType w:val="hybridMultilevel"/>
+    <w:lvl w:ilvl="0" w15:tentative="1">
+      <w:start w:val="1"/>
+      <w:numFmt w:val="decimal"/>
+      <w:lvlText w:val="%1."/>
+      <w:lvlJc w:val="left"/>
+      <w:pPr>
+        <w:ind w:left="720" w:hanging="360"/>
+      </w:pPr>
+    </w:lvl>
+  </w:abstractNum>
+  <w:abstractNum w:abstractNumId="121" w15:restartNumberingAfterBreak="0">
+    <w:multiLevelType w:val="hybridMultilevel"/>
+    <w:lvl w:ilvl="0" w15:tentative="1">
+      <w:start w:val="1"/>
+      <w:numFmt w:val="decimal"/>
+      <w:lvlText w:val="%1."/>
+      <w:lvlJc w:val="left"/>
+      <w:pPr>
+        <w:ind w:left="720" w:hanging="360"/>
+      </w:pPr>
+    </w:lvl>
+  </w:abstractNum>
+  <w:abstractNum w:abstractNumId="122" w15:restartNumberingAfterBreak="0">
+    <w:multiLevelType w:val="hybridMultilevel"/>
+    <w:lvl w:ilvl="0" w15:tentative="1">
+      <w:start w:val="1"/>
+      <w:numFmt w:val="decimal"/>
+      <w:lvlText w:val="%1."/>
+      <w:lvlJc w:val="left"/>
+      <w:pPr>
+        <w:ind w:left="720" w:hanging="360"/>
+      </w:pPr>
+    </w:lvl>
+  </w:abstractNum>
+  <w:abstractNum w:abstractNumId="123" w15:restartNumberingAfterBreak="0">
+    <w:multiLevelType w:val="hybridMultilevel"/>
+    <w:lvl w:ilvl="0" w15:tentative="1">
+      <w:start w:val="1"/>
+      <w:numFmt w:val="decimal"/>
+      <w:lvlText w:val="%1."/>
+      <w:lvlJc w:val="left"/>
+      <w:pPr>
+        <w:ind w:left="720" w:hanging="360"/>
+      </w:pPr>
+    </w:lvl>
+  </w:abstractNum>
+  <w:abstractNum w:abstractNumId="124" w15:restartNumberingAfterBreak="0">
+    <w:multiLevelType w:val="hybridMultilevel"/>
+    <w:lvl w:ilvl="0" w15:tentative="1">
+      <w:start w:val="1"/>
+      <w:numFmt w:val="decimal"/>
+      <w:lvlText w:val="%1."/>
+      <w:lvlJc w:val="left"/>
+      <w:pPr>
+        <w:ind w:left="720" w:hanging="360"/>
+      </w:pPr>
+    </w:lvl>
+  </w:abstractNum>
+  <w:abstractNum w:abstractNumId="125" w15:restartNumberingAfterBreak="0">
+    <w:multiLevelType w:val="hybridMultilevel"/>
+    <w:lvl w:ilvl="0" w15:tentative="1">
+      <w:start w:val="1"/>
+      <w:numFmt w:val="decimal"/>
+      <w:lvlText w:val="%1."/>
+      <w:lvlJc w:val="left"/>
+      <w:pPr>
+        <w:ind w:left="720" w:hanging="360"/>
+      </w:pPr>
+    </w:lvl>
+  </w:abstractNum>
+  <w:abstractNum w:abstractNumId="126" w15:restartNumberingAfterBreak="0">
+    <w:multiLevelType w:val="hybridMultilevel"/>
+    <w:lvl w:ilvl="0" w15:tentative="1">
+      <w:start w:val="1"/>
+      <w:numFmt w:val="decimal"/>
+      <w:lvlText w:val="%1."/>
+      <w:lvlJc w:val="left"/>
+      <w:pPr>
+        <w:ind w:left="720" w:hanging="360"/>
+      </w:pPr>
+    </w:lvl>
+  </w:abstractNum>
+  <w:abstractNum w:abstractNumId="127" w15:restartNumberingAfterBreak="0">
+    <w:multiLevelType w:val="hybridMultilevel"/>
+    <w:lvl w:ilvl="0" w15:tentative="1">
+      <w:start w:val="1"/>
+      <w:numFmt w:val="decimal"/>
+      <w:lvlText w:val="%1."/>
+      <w:lvlJc w:val="left"/>
+      <w:pPr>
+        <w:ind w:left="720" w:hanging="360"/>
+      </w:pPr>
+    </w:lvl>
+  </w:abstractNum>
+  <w:abstractNum w:abstractNumId="128" w15:restartNumberingAfterBreak="0">
+    <w:multiLevelType w:val="hybridMultilevel"/>
+    <w:lvl w:ilvl="0" w15:tentative="1">
+      <w:start w:val="1"/>
+      <w:numFmt w:val="decimal"/>
+      <w:lvlText w:val="%1."/>
+      <w:lvlJc w:val="left"/>
+      <w:pPr>
+        <w:ind w:left="720" w:hanging="360"/>
+      </w:pPr>
+    </w:lvl>
+  </w:abstractNum>
+  <w:abstractNum w:abstractNumId="129" w15:restartNumberingAfterBreak="0">
+    <w:multiLevelType w:val="hybridMultilevel"/>
+    <w:lvl w:ilvl="0" w15:tentative="1">
+      <w:start w:val="1"/>
+      <w:numFmt w:val="decimal"/>
+      <w:lvlText w:val="%1."/>
+      <w:lvlJc w:val="left"/>
+      <w:pPr>
+        <w:ind w:left="720" w:hanging="360"/>
+      </w:pPr>
+    </w:lvl>
+  </w:abstractNum>
+  <w:abstractNum w:abstractNumId="130" w15:restartNumberingAfterBreak="0">
+    <w:multiLevelType w:val="hybridMultilevel"/>
+    <w:lvl w:ilvl="0" w15:tentative="1">
+      <w:start w:val="1"/>
+      <w:numFmt w:val="decimal"/>
+      <w:lvlText w:val="%1."/>
+      <w:lvlJc w:val="left"/>
+      <w:pPr>
+        <w:ind w:left="720" w:hanging="360"/>
+      </w:pPr>
+    </w:lvl>
+  </w:abstractNum>
+  <w:abstractNum w:abstractNumId="131" w15:restartNumberingAfterBreak="0">
+    <w:multiLevelType w:val="hybridMultilevel"/>
+    <w:lvl w:ilvl="0" w15:tentative="1">
+      <w:start w:val="1"/>
+      <w:numFmt w:val="decimal"/>
+      <w:lvlText w:val="%1."/>
+      <w:lvlJc w:val="left"/>
+      <w:pPr>
+        <w:ind w:left="720" w:hanging="360"/>
+      </w:pPr>
+    </w:lvl>
+  </w:abstractNum>
+  <w:abstractNum w:abstractNumId="132" w15:restartNumberingAfterBreak="0">
+    <w:multiLevelType w:val="hybridMultilevel"/>
+    <w:lvl w:ilvl="0" w15:tentative="1">
+      <w:start w:val="1"/>
+      <w:numFmt w:val="decimal"/>
+      <w:lvlText w:val="%1."/>
+      <w:lvlJc w:val="left"/>
+      <w:pPr>
+        <w:ind w:left="720" w:hanging="360"/>
+      </w:pPr>
+    </w:lvl>
+  </w:abstractNum>
+  <w:abstractNum w:abstractNumId="133" w15:restartNumberingAfterBreak="0">
+    <w:multiLevelType w:val="hybridMultilevel"/>
+    <w:lvl w:ilvl="0" w15:tentative="1">
+      <w:start w:val="1"/>
+      <w:numFmt w:val="decimal"/>
+      <w:lvlText w:val="%1."/>
+      <w:lvlJc w:val="left"/>
+      <w:pPr>
+        <w:ind w:left="720" w:hanging="360"/>
+      </w:pPr>
+    </w:lvl>
+  </w:abstractNum>
+  <w:abstractNum w:abstractNumId="134" w15:restartNumberingAfterBreak="0">
+    <w:multiLevelType w:val="hybridMultilevel"/>
+    <w:lvl w:ilvl="0" w15:tentative="1">
+      <w:start w:val="1"/>
+      <w:numFmt w:val="decimal"/>
+      <w:lvlText w:val="%1."/>
+      <w:lvlJc w:val="left"/>
+      <w:pPr>
+        <w:ind w:left="720" w:hanging="360"/>
+      </w:pPr>
+    </w:lvl>
+  </w:abstractNum>
+  <w:abstractNum w:abstractNumId="135" w15:restartNumberingAfterBreak="0">
+    <w:multiLevelType w:val="hybridMultilevel"/>
+    <w:lvl w:ilvl="0" w15:tentative="1">
+      <w:start w:val="1"/>
+      <w:numFmt w:val="decimal"/>
+      <w:lvlText w:val="%1."/>
+      <w:lvlJc w:val="left"/>
+      <w:pPr>
+        <w:ind w:left="720" w:hanging="360"/>
+      </w:pPr>
+    </w:lvl>
+  </w:abstractNum>
+  <w:abstractNum w:abstractNumId="136" w15:restartNumberingAfterBreak="0">
+    <w:multiLevelType w:val="hybridMultilevel"/>
+    <w:lvl w:ilvl="0" w15:tentative="1">
+      <w:start w:val="1"/>
+      <w:numFmt w:val="decimal"/>
+      <w:lvlText w:val="%1."/>
+      <w:lvlJc w:val="left"/>
+      <w:pPr>
+        <w:ind w:left="720" w:hanging="360"/>
+      </w:pPr>
+    </w:lvl>
+  </w:abstractNum>
+  <w:abstractNum w:abstractNumId="137" w15:restartNumberingAfterBreak="0">
+    <w:multiLevelType w:val="hybridMultilevel"/>
+    <w:lvl w:ilvl="0" w15:tentative="1">
+      <w:start w:val="1"/>
+      <w:numFmt w:val="decimal"/>
+      <w:lvlText w:val="%1."/>
+      <w:lvlJc w:val="left"/>
+      <w:pPr>
+        <w:ind w:left="720" w:hanging="360"/>
+      </w:pPr>
+    </w:lvl>
+  </w:abstractNum>
+  <w:abstractNum w:abstractNumId="138" w15:restartNumberingAfterBreak="0">
+    <w:multiLevelType w:val="hybridMultilevel"/>
+    <w:lvl w:ilvl="0" w15:tentative="1">
+      <w:start w:val="1"/>
+      <w:numFmt w:val="decimal"/>
+      <w:lvlText w:val="%1."/>
+      <w:lvlJc w:val="left"/>
+      <w:pPr>
+        <w:ind w:left="720" w:hanging="360"/>
+      </w:pPr>
+    </w:lvl>
+  </w:abstractNum>
+  <w:abstractNum w:abstractNumId="139" w15:restartNumberingAfterBreak="0">
+    <w:multiLevelType w:val="hybridMultilevel"/>
+    <w:lvl w:ilvl="0" w15:tentative="1">
+      <w:start w:val="1"/>
+      <w:numFmt w:val="decimal"/>
+      <w:lvlText w:val="%1."/>
+      <w:lvlJc w:val="left"/>
+      <w:pPr>
+        <w:ind w:left="720" w:hanging="360"/>
+      </w:pPr>
+    </w:lvl>
+  </w:abstractNum>
+  <w:abstractNum w:abstractNumId="140" w15:restartNumberingAfterBreak="0">
+    <w:multiLevelType w:val="hybridMultilevel"/>
+    <w:lvl w:ilvl="0" w15:tentative="1">
+      <w:start w:val="1"/>
+      <w:numFmt w:val="decimal"/>
+      <w:lvlText w:val="%1."/>
+      <w:lvlJc w:val="left"/>
+      <w:pPr>
+        <w:ind w:left="720" w:hanging="360"/>
+      </w:pPr>
+    </w:lvl>
+  </w:abstractNum>
+  <w:abstractNum w:abstractNumId="141" w15:restartNumberingAfterBreak="0">
+    <w:multiLevelType w:val="hybridMultilevel"/>
+    <w:lvl w:ilvl="0" w15:tentative="1">
+      <w:start w:val="1"/>
+      <w:numFmt w:val="decimal"/>
+      <w:lvlText w:val="%1."/>
+      <w:lvlJc w:val="left"/>
+      <w:pPr>
+        <w:ind w:left="720" w:hanging="360"/>
+      </w:pPr>
+    </w:lvl>
+  </w:abstractNum>
+  <w:abstractNum w:abstractNumId="142" w15:restartNumberingAfterBreak="0">
+    <w:multiLevelType w:val="hybridMultilevel"/>
+    <w:lvl w:ilvl="0" w15:tentative="1">
+      <w:start w:val="1"/>
+      <w:numFmt w:val="decimal"/>
+      <w:lvlText w:val="%1."/>
+      <w:lvlJc w:val="left"/>
+      <w:pPr>
+        <w:ind w:left="720" w:hanging="360"/>
+      </w:pPr>
+    </w:lvl>
+  </w:abstractNum>
+  <w:abstractNum w:abstractNumId="143" w15:restartNumberingAfterBreak="0">
+    <w:multiLevelType w:val="hybridMultilevel"/>
+    <w:lvl w:ilvl="0" w15:tentative="1">
+      <w:start w:val="1"/>
+      <w:numFmt w:val="decimal"/>
+      <w:lvlText w:val="%1."/>
+      <w:lvlJc w:val="left"/>
+      <w:pPr>
+        <w:ind w:left="720" w:hanging="360"/>
+      </w:pPr>
+    </w:lvl>
+  </w:abstractNum>
+  <w:abstractNum w:abstractNumId="144" w15:restartNumberingAfterBreak="0">
+    <w:multiLevelType w:val="hybridMultilevel"/>
+    <w:lvl w:ilvl="0" w15:tentative="1">
+      <w:start w:val="1"/>
+      <w:numFmt w:val="decimal"/>
+      <w:lvlText w:val="%1."/>
+      <w:lvlJc w:val="left"/>
+      <w:pPr>
+        <w:ind w:left="720" w:hanging="360"/>
+      </w:pPr>
+    </w:lvl>
+  </w:abstractNum>
+  <w:abstractNum w:abstractNumId="145" w15:restartNumberingAfterBreak="0">
+    <w:multiLevelType w:val="hybridMultilevel"/>
+    <w:lvl w:ilvl="0" w15:tentative="1">
+      <w:start w:val="1"/>
+      <w:numFmt w:val="decimal"/>
+      <w:lvlText w:val="%1."/>
+      <w:lvlJc w:val="left"/>
+      <w:pPr>
+        <w:ind w:left="720" w:hanging="360"/>
+      </w:pPr>
+    </w:lvl>
+  </w:abstractNum>
   <w:num w:numId="1">
     <w:abstractNumId w:val="1"/>
     <w:lvlOverride w:ilvl="0">
@@ -23823,7 +25527,97 @@
     </w:lvlOverride>
   </w:num>
   <w:num w:numId="3">
-    <w:abstractNumId w:val="3"/>
+    <w:abstractNumId w:val="7"/>
+    <w:lvlOverride w:ilvl="0">
+      <w:startOverride w:val="1"/>
+    </w:lvlOverride>
+  </w:num>
+  <w:num w:numId="4">
+    <w:abstractNumId w:val="21"/>
+    <w:lvlOverride w:ilvl="0">
+      <w:startOverride w:val="1"/>
+    </w:lvlOverride>
+  </w:num>
+  <w:num w:numId="5">
+    <w:abstractNumId w:val="44"/>
+    <w:lvlOverride w:ilvl="0">
+      <w:startOverride w:val="1"/>
+    </w:lvlOverride>
+  </w:num>
+  <w:num w:numId="6">
+    <w:abstractNumId w:val="51"/>
+    <w:lvlOverride w:ilvl="0">
+      <w:startOverride w:val="1"/>
+    </w:lvlOverride>
+  </w:num>
+  <w:num w:numId="7">
+    <w:abstractNumId w:val="63"/>
+    <w:lvlOverride w:ilvl="0">
+      <w:startOverride w:val="1"/>
+    </w:lvlOverride>
+  </w:num>
+  <w:num w:numId="8">
+    <w:abstractNumId w:val="66"/>
+    <w:lvlOverride w:ilvl="0">
+      <w:startOverride w:val="1"/>
+    </w:lvlOverride>
+  </w:num>
+  <w:num w:numId="9">
+    <w:abstractNumId w:val="74"/>
+    <w:lvlOverride w:ilvl="0">
+      <w:startOverride w:val="1"/>
+    </w:lvlOverride>
+  </w:num>
+  <w:num w:numId="10">
+    <w:abstractNumId w:val="75"/>
+    <w:lvlOverride w:ilvl="0">
+      <w:startOverride w:val="1"/>
+    </w:lvlOverride>
+  </w:num>
+  <w:num w:numId="11">
+    <w:abstractNumId w:val="76"/>
+    <w:lvlOverride w:ilvl="0">
+      <w:startOverride w:val="1"/>
+    </w:lvlOverride>
+  </w:num>
+  <w:num w:numId="12">
+    <w:abstractNumId w:val="77"/>
+    <w:lvlOverride w:ilvl="0">
+      <w:startOverride w:val="1"/>
+    </w:lvlOverride>
+  </w:num>
+  <w:num w:numId="13">
+    <w:abstractNumId w:val="78"/>
+    <w:lvlOverride w:ilvl="0">
+      <w:startOverride w:val="1"/>
+    </w:lvlOverride>
+  </w:num>
+  <w:num w:numId="14">
+    <w:abstractNumId w:val="83"/>
+    <w:lvlOverride w:ilvl="0">
+      <w:startOverride w:val="1"/>
+    </w:lvlOverride>
+  </w:num>
+  <w:num w:numId="15">
+    <w:abstractNumId w:val="87"/>
+    <w:lvlOverride w:ilvl="0">
+      <w:startOverride w:val="1"/>
+    </w:lvlOverride>
+  </w:num>
+  <w:num w:numId="16">
+    <w:abstractNumId w:val="95"/>
+    <w:lvlOverride w:ilvl="0">
+      <w:startOverride w:val="1"/>
+    </w:lvlOverride>
+  </w:num>
+  <w:num w:numId="17">
+    <w:abstractNumId w:val="97"/>
+    <w:lvlOverride w:ilvl="0">
+      <w:startOverride w:val="1"/>
+    </w:lvlOverride>
+  </w:num>
+  <w:num w:numId="18">
+    <w:abstractNumId w:val="131"/>
     <w:lvlOverride w:ilvl="0">
       <w:startOverride w:val="1"/>
     </w:lvlOverride>

</xml_diff>

<commit_message>
Camps page: render cards as HTML string + slim JSON payload to fix Cloudflare 1102 (Worker CPU exceeded)
</commit_message>
<xml_diff>
--- a/Parent_Coach_Playbook_Business_Plan.docx
+++ b/Parent_Coach_Playbook_Business_Plan.docx
@@ -92,19 +92,7 @@
           <w:sz w:val="18"/>
           <w:szCs w:val="18"/>
         </w:rPr>
-        <w:t xml:space="preserve">PREPARED FOR</w:t>
-      </w:r>
-      <w:r>
-        <w:rPr>
-          <w:rFonts w:ascii="Calibri" w:cs="Calibri" w:eastAsia="Calibri" w:hAnsi="Calibri"/>
-          <w:b/>
-          <w:bCs/>
-          <w:color w:val="5B6661"/>
-          <w:spacing w:val="60"/>
-          <w:sz w:val="18"/>
-          <w:szCs w:val="18"/>
-        </w:rPr>
-        <w:t xml:space="preserve">	PREPARED BY</w:t>
+        <w:t>PREPARED FOR	PREPARED BY</w:t>
       </w:r>
     </w:p>
     <w:p>
@@ -123,18 +111,7 @@
           <w:sz w:val="24"/>
           <w:szCs w:val="24"/>
         </w:rPr>
-        <w:t xml:space="preserve">Jeff Thomas</w:t>
-      </w:r>
-      <w:r>
-        <w:rPr>
-          <w:rFonts w:ascii="Calibri" w:cs="Calibri" w:eastAsia="Calibri" w:hAnsi="Calibri"/>
-          <w:b/>
-          <w:bCs/>
-          <w:color w:val="1F2421"/>
-          <w:sz w:val="24"/>
-          <w:szCs w:val="24"/>
-        </w:rPr>
-        <w:t xml:space="preserve">	Northshore Strategic Advisory</w:t>
+        <w:t>Jeff Thomas	Northshore Strategic Advisory</w:t>
       </w:r>
     </w:p>
     <w:p>
@@ -151,16 +128,7 @@
           <w:sz w:val="21"/>
           <w:szCs w:val="21"/>
         </w:rPr>
-        <w:t xml:space="preserve">Owner, eepskalla LLC</w:t>
-      </w:r>
-      <w:r>
-        <w:rPr>
-          <w:rFonts w:ascii="Calibri" w:cs="Calibri" w:eastAsia="Calibri" w:hAnsi="Calibri"/>
-          <w:color w:val="5B6661"/>
-          <w:sz w:val="21"/>
-          <w:szCs w:val="21"/>
-        </w:rPr>
-        <w:t xml:space="preserve">	Independent Strategic Review</w:t>
+        <w:t>Owner, eepskalla LLC	Independent Strategic Review</w:t>
       </w:r>
     </w:p>
     <w:p>
@@ -177,16 +145,7 @@
           <w:sz w:val="21"/>
           <w:szCs w:val="21"/>
         </w:rPr>
-        <w:t xml:space="preserve">DBA Parent Coach Playbook (pending)</w:t>
-      </w:r>
-      <w:r>
-        <w:rPr>
-          <w:rFonts w:ascii="Calibri" w:cs="Calibri" w:eastAsia="Calibri" w:hAnsi="Calibri"/>
-          <w:color w:val="5B6661"/>
-          <w:sz w:val="21"/>
-          <w:szCs w:val="21"/>
-        </w:rPr>
-        <w:t xml:space="preserve">	Pacific Northwest</w:t>
+        <w:t>DBA Parent Coach Playbook (pending)	Pacific Northwest</w:t>
       </w:r>
     </w:p>
     <w:p>
@@ -245,34 +204,426 @@
         <w:t xml:space="preserve">Contents</w:t>
       </w:r>
     </w:p>
-    <w:sdt>
-      <w:sdtPr>
-        <w:alias w:val="Table of Contents"/>
-      </w:sdtPr>
-      <w:sdtContent>
-        <w:p>
-          <w:r>
-            <w:fldChar w:fldCharType="begin" w:dirty="true"/>
-            <w:instrText xml:space="preserve">TOC \h \o "1-2"</w:instrText>
-            <w:fldChar w:fldCharType="separate"/>
-          </w:r>
-        </w:p>
-        <w:p>
-          <w:r>
-            <w:fldChar w:fldCharType="end"/>
-          </w:r>
-        </w:p>
-      </w:sdtContent>
-    </w:sdt>
+    <w:p>
+      <w:pPr>
+        <w:spacing w:after="200"/>
+      </w:pPr>
+      <w:r>
+        <w:rPr>
+          <w:rFonts w:ascii="Cambria" w:cs="Cambria" w:eastAsia="Cambria" w:hAnsi="Cambria"/>
+          <w:i/>
+          <w:iCs/>
+          <w:color w:val="5B6661"/>
+          <w:sz w:val="22"/>
+          <w:szCs w:val="22"/>
+        </w:rPr>
+        <w:t xml:space="preserve">Sections</w:t>
+      </w:r>
+    </w:p>
+    <w:p>
+      <w:pPr>
+        <w:tabs>
+          <w:tab w:val="right" w:pos="9026"/>
+        </w:tabs>
+        <w:spacing w:after="100" w:line="280"/>
+      </w:pPr>
+      <w:hyperlink w:history="1" w:anchor="sec_h1_1">
+        <w:r>
+          <w:rPr>
+            <w:rFonts w:ascii="Calibri" w:cs="Calibri" w:eastAsia="Calibri" w:hAnsi="Calibri"/>
+            <w:color w:val="1F2421"/>
+            <w:sz w:val="22"/>
+            <w:szCs w:val="22"/>
+          </w:rPr>
+          <w:t xml:space="preserve">1. Executive Summary</w:t>
+        </w:r>
+      </w:hyperlink>
+    </w:p>
+    <w:p>
+      <w:pPr>
+        <w:tabs>
+          <w:tab w:val="right" w:pos="9026"/>
+        </w:tabs>
+        <w:spacing w:after="100" w:line="280"/>
+      </w:pPr>
+      <w:hyperlink w:history="1" w:anchor="sec_h1_2">
+        <w:r>
+          <w:rPr>
+            <w:rFonts w:ascii="Calibri" w:cs="Calibri" w:eastAsia="Calibri" w:hAnsi="Calibri"/>
+            <w:color w:val="1F2421"/>
+            <w:sz w:val="22"/>
+            <w:szCs w:val="22"/>
+          </w:rPr>
+          <w:t xml:space="preserve">2. Market and Competitive Landscape</w:t>
+        </w:r>
+      </w:hyperlink>
+    </w:p>
+    <w:p>
+      <w:pPr>
+        <w:tabs>
+          <w:tab w:val="right" w:pos="9026"/>
+        </w:tabs>
+        <w:spacing w:after="100" w:line="280"/>
+      </w:pPr>
+      <w:hyperlink w:history="1" w:anchor="sec_h1_3">
+        <w:r>
+          <w:rPr>
+            <w:rFonts w:ascii="Calibri" w:cs="Calibri" w:eastAsia="Calibri" w:hAnsi="Calibri"/>
+            <w:color w:val="1F2421"/>
+            <w:sz w:val="22"/>
+            <w:szCs w:val="22"/>
+          </w:rPr>
+          <w:t xml:space="preserve">3. Where We Are Today</w:t>
+        </w:r>
+      </w:hyperlink>
+    </w:p>
+    <w:p>
+      <w:pPr>
+        <w:tabs>
+          <w:tab w:val="right" w:pos="9026"/>
+        </w:tabs>
+        <w:spacing w:after="100" w:line="280"/>
+      </w:pPr>
+      <w:hyperlink w:history="1" w:anchor="sec_h1_4">
+        <w:r>
+          <w:rPr>
+            <w:rFonts w:ascii="Calibri" w:cs="Calibri" w:eastAsia="Calibri" w:hAnsi="Calibri"/>
+            <w:color w:val="1F2421"/>
+            <w:sz w:val="22"/>
+            <w:szCs w:val="22"/>
+          </w:rPr>
+          <w:t xml:space="preserve">4. Strategy and Positioning</w:t>
+        </w:r>
+      </w:hyperlink>
+    </w:p>
+    <w:p>
+      <w:pPr>
+        <w:tabs>
+          <w:tab w:val="right" w:pos="9026"/>
+        </w:tabs>
+        <w:spacing w:after="100" w:line="280"/>
+      </w:pPr>
+      <w:hyperlink w:history="1" w:anchor="sec_h1_5">
+        <w:r>
+          <w:rPr>
+            <w:rFonts w:ascii="Calibri" w:cs="Calibri" w:eastAsia="Calibri" w:hAnsi="Calibri"/>
+            <w:color w:val="1F2421"/>
+            <w:sz w:val="22"/>
+            <w:szCs w:val="22"/>
+          </w:rPr>
+          <w:t xml:space="preserve">5. Five Revenue Lines</w:t>
+        </w:r>
+      </w:hyperlink>
+    </w:p>
+    <w:p>
+      <w:pPr>
+        <w:tabs>
+          <w:tab w:val="right" w:pos="9026"/>
+        </w:tabs>
+        <w:spacing w:after="100" w:line="280"/>
+      </w:pPr>
+      <w:hyperlink w:history="1" w:anchor="sec_h1_6">
+        <w:r>
+          <w:rPr>
+            <w:rFonts w:ascii="Calibri" w:cs="Calibri" w:eastAsia="Calibri" w:hAnsi="Calibri"/>
+            <w:color w:val="1F2421"/>
+            <w:sz w:val="22"/>
+            <w:szCs w:val="22"/>
+          </w:rPr>
+          <w:t xml:space="preserve">6. Unit Economics</w:t>
+        </w:r>
+      </w:hyperlink>
+    </w:p>
+    <w:p>
+      <w:pPr>
+        <w:tabs>
+          <w:tab w:val="right" w:pos="9026"/>
+        </w:tabs>
+        <w:spacing w:after="100" w:line="280"/>
+      </w:pPr>
+      <w:hyperlink w:history="1" w:anchor="sec_h1_7">
+        <w:r>
+          <w:rPr>
+            <w:rFonts w:ascii="Calibri" w:cs="Calibri" w:eastAsia="Calibri" w:hAnsi="Calibri"/>
+            <w:color w:val="1F2421"/>
+            <w:sz w:val="22"/>
+            <w:szCs w:val="22"/>
+          </w:rPr>
+          <w:t xml:space="preserve">7. Cashflow Scenarios</w:t>
+        </w:r>
+      </w:hyperlink>
+    </w:p>
+    <w:p>
+      <w:pPr>
+        <w:tabs>
+          <w:tab w:val="right" w:pos="9026"/>
+        </w:tabs>
+        <w:spacing w:after="100" w:line="280"/>
+      </w:pPr>
+      <w:hyperlink w:history="1" w:anchor="sec_h1_8">
+        <w:r>
+          <w:rPr>
+            <w:rFonts w:ascii="Calibri" w:cs="Calibri" w:eastAsia="Calibri" w:hAnsi="Calibri"/>
+            <w:color w:val="1F2421"/>
+            <w:sz w:val="22"/>
+            <w:szCs w:val="22"/>
+          </w:rPr>
+          <w:t xml:space="preserve">8. Traffic and Audience Growth</w:t>
+        </w:r>
+      </w:hyperlink>
+    </w:p>
+    <w:p>
+      <w:pPr>
+        <w:tabs>
+          <w:tab w:val="right" w:pos="9026"/>
+        </w:tabs>
+        <w:spacing w:after="100" w:line="280"/>
+      </w:pPr>
+      <w:hyperlink w:history="1" w:anchor="sec_h1_9">
+        <w:r>
+          <w:rPr>
+            <w:rFonts w:ascii="Calibri" w:cs="Calibri" w:eastAsia="Calibri" w:hAnsi="Calibri"/>
+            <w:color w:val="1F2421"/>
+            <w:sz w:val="22"/>
+            <w:szCs w:val="22"/>
+          </w:rPr>
+          <w:t xml:space="preserve">9. Operations</w:t>
+        </w:r>
+      </w:hyperlink>
+    </w:p>
+    <w:p>
+      <w:pPr>
+        <w:tabs>
+          <w:tab w:val="right" w:pos="9026"/>
+        </w:tabs>
+        <w:spacing w:after="100" w:line="280"/>
+      </w:pPr>
+      <w:hyperlink w:history="1" w:anchor="sec_h1_10">
+        <w:r>
+          <w:rPr>
+            <w:rFonts w:ascii="Calibri" w:cs="Calibri" w:eastAsia="Calibri" w:hAnsi="Calibri"/>
+            <w:color w:val="1F2421"/>
+            <w:sz w:val="22"/>
+            <w:szCs w:val="22"/>
+          </w:rPr>
+          <w:t xml:space="preserve">10. SEO Infrastructure</w:t>
+        </w:r>
+      </w:hyperlink>
+    </w:p>
+    <w:p>
+      <w:pPr>
+        <w:tabs>
+          <w:tab w:val="right" w:pos="9026"/>
+        </w:tabs>
+        <w:spacing w:after="100" w:line="280"/>
+      </w:pPr>
+      <w:hyperlink w:history="1" w:anchor="sec_h1_11">
+        <w:r>
+          <w:rPr>
+            <w:rFonts w:ascii="Calibri" w:cs="Calibri" w:eastAsia="Calibri" w:hAnsi="Calibri"/>
+            <w:color w:val="1F2421"/>
+            <w:sz w:val="22"/>
+            <w:szCs w:val="22"/>
+          </w:rPr>
+          <w:t xml:space="preserve">11. Distribution Channels</w:t>
+        </w:r>
+      </w:hyperlink>
+    </w:p>
+    <w:p>
+      <w:pPr>
+        <w:tabs>
+          <w:tab w:val="right" w:pos="9026"/>
+        </w:tabs>
+        <w:spacing w:after="100" w:line="280"/>
+      </w:pPr>
+      <w:hyperlink w:history="1" w:anchor="sec_h1_12">
+        <w:r>
+          <w:rPr>
+            <w:rFonts w:ascii="Calibri" w:cs="Calibri" w:eastAsia="Calibri" w:hAnsi="Calibri"/>
+            <w:color w:val="1F2421"/>
+            <w:sz w:val="22"/>
+            <w:szCs w:val="22"/>
+          </w:rPr>
+          <w:t xml:space="preserve">12. Legal Structure, Compliance, and Insurance</w:t>
+        </w:r>
+      </w:hyperlink>
+    </w:p>
+    <w:p>
+      <w:pPr>
+        <w:tabs>
+          <w:tab w:val="right" w:pos="9026"/>
+        </w:tabs>
+        <w:spacing w:after="100" w:line="280"/>
+      </w:pPr>
+      <w:hyperlink w:history="1" w:anchor="sec_h1_13">
+        <w:r>
+          <w:rPr>
+            <w:rFonts w:ascii="Calibri" w:cs="Calibri" w:eastAsia="Calibri" w:hAnsi="Calibri"/>
+            <w:color w:val="1F2421"/>
+            <w:sz w:val="22"/>
+            <w:szCs w:val="22"/>
+          </w:rPr>
+          <w:t xml:space="preserve">13. Parent Coach Approved (Brand Mark Spec)</w:t>
+        </w:r>
+      </w:hyperlink>
+    </w:p>
+    <w:p>
+      <w:pPr>
+        <w:tabs>
+          <w:tab w:val="right" w:pos="9026"/>
+        </w:tabs>
+        <w:spacing w:after="100" w:line="280"/>
+      </w:pPr>
+      <w:hyperlink w:history="1" w:anchor="sec_h1_14">
+        <w:r>
+          <w:rPr>
+            <w:rFonts w:ascii="Calibri" w:cs="Calibri" w:eastAsia="Calibri" w:hAnsi="Calibri"/>
+            <w:color w:val="1F2421"/>
+            <w:sz w:val="22"/>
+            <w:szCs w:val="22"/>
+          </w:rPr>
+          <w:t xml:space="preserve">14. Milestone Gates</w:t>
+        </w:r>
+      </w:hyperlink>
+    </w:p>
+    <w:p>
+      <w:pPr>
+        <w:tabs>
+          <w:tab w:val="right" w:pos="9026"/>
+        </w:tabs>
+        <w:spacing w:after="100" w:line="280"/>
+      </w:pPr>
+      <w:hyperlink w:history="1" w:anchor="sec_h1_15">
+        <w:r>
+          <w:rPr>
+            <w:rFonts w:ascii="Calibri" w:cs="Calibri" w:eastAsia="Calibri" w:hAnsi="Calibri"/>
+            <w:color w:val="1F2421"/>
+            <w:sz w:val="22"/>
+            <w:szCs w:val="22"/>
+          </w:rPr>
+          <w:t xml:space="preserve">15. KPIs to Watch</w:t>
+        </w:r>
+      </w:hyperlink>
+    </w:p>
+    <w:p>
+      <w:pPr>
+        <w:tabs>
+          <w:tab w:val="right" w:pos="9026"/>
+        </w:tabs>
+        <w:spacing w:after="100" w:line="280"/>
+      </w:pPr>
+      <w:hyperlink w:history="1" w:anchor="sec_h1_16">
+        <w:r>
+          <w:rPr>
+            <w:rFonts w:ascii="Calibri" w:cs="Calibri" w:eastAsia="Calibri" w:hAnsi="Calibri"/>
+            <w:color w:val="1F2421"/>
+            <w:sz w:val="22"/>
+            <w:szCs w:val="22"/>
+          </w:rPr>
+          <w:t xml:space="preserve">16. Risks and Mitigations</w:t>
+        </w:r>
+      </w:hyperlink>
+    </w:p>
+    <w:p>
+      <w:pPr>
+        <w:tabs>
+          <w:tab w:val="right" w:pos="9026"/>
+        </w:tabs>
+        <w:spacing w:after="100" w:line="280"/>
+      </w:pPr>
+      <w:hyperlink w:history="1" w:anchor="sec_h1_17">
+        <w:r>
+          <w:rPr>
+            <w:rFonts w:ascii="Calibri" w:cs="Calibri" w:eastAsia="Calibri" w:hAnsi="Calibri"/>
+            <w:color w:val="1F2421"/>
+            <w:sz w:val="22"/>
+            <w:szCs w:val="22"/>
+          </w:rPr>
+          <w:t xml:space="preserve">17. Quarter-by-Quarter Execution</w:t>
+        </w:r>
+      </w:hyperlink>
+    </w:p>
+    <w:p>
+      <w:pPr>
+        <w:tabs>
+          <w:tab w:val="right" w:pos="9026"/>
+        </w:tabs>
+        <w:spacing w:after="100" w:line="280"/>
+      </w:pPr>
+      <w:hyperlink w:history="1" w:anchor="sec_h1_18">
+        <w:r>
+          <w:rPr>
+            <w:rFonts w:ascii="Calibri" w:cs="Calibri" w:eastAsia="Calibri" w:hAnsi="Calibri"/>
+            <w:color w:val="1F2421"/>
+            <w:sz w:val="22"/>
+            <w:szCs w:val="22"/>
+          </w:rPr>
+          <w:t xml:space="preserve">18. Exit and Asset Framing</w:t>
+        </w:r>
+      </w:hyperlink>
+    </w:p>
+    <w:p>
+      <w:pPr>
+        <w:tabs>
+          <w:tab w:val="right" w:pos="9026"/>
+        </w:tabs>
+        <w:spacing w:after="100" w:line="280"/>
+      </w:pPr>
+      <w:hyperlink w:history="1" w:anchor="sec_h1_19">
+        <w:r>
+          <w:rPr>
+            <w:rFonts w:ascii="Calibri" w:cs="Calibri" w:eastAsia="Calibri" w:hAnsi="Calibri"/>
+            <w:color w:val="1F2421"/>
+            <w:sz w:val="22"/>
+            <w:szCs w:val="22"/>
+          </w:rPr>
+          <w:t xml:space="preserve">Appendix A: Financial Model Assumptions</w:t>
+        </w:r>
+      </w:hyperlink>
+    </w:p>
+    <w:p>
+      <w:pPr>
+        <w:pBdr>
+          <w:top w:val="single" w:color="CCCCCC" w:sz="4" w:space="1"/>
+        </w:pBdr>
+        <w:spacing w:before="320"/>
+      </w:pPr>
+      <w:r>
+        <w:rPr>
+          <w:rFonts w:ascii="Calibri" w:cs="Calibri" w:eastAsia="Calibri" w:hAnsi="Calibri"/>
+          <w:sz w:val="18"/>
+          <w:szCs w:val="18"/>
+        </w:rPr>
+        <w:t xml:space="preserve"/>
+      </w:r>
+    </w:p>
+    <w:p>
+      <w:pPr>
+        <w:spacing w:after="120"/>
+      </w:pPr>
+      <w:r>
+        <w:rPr>
+          <w:rFonts w:ascii="Calibri" w:cs="Calibri" w:eastAsia="Calibri" w:hAnsi="Calibri"/>
+          <w:i/>
+          <w:iCs/>
+          <w:color w:val="5B6661"/>
+          <w:sz w:val="18"/>
+          <w:szCs w:val="18"/>
+        </w:rPr>
+        <w:t xml:space="preserve">Pagination is dynamic. Section links above jump to the relevant H1.</w:t>
+      </w:r>
+    </w:p>
     <w:p>
       <w:pPr>
         <w:pStyle w:val="Heading1"/>
         <w:pageBreakBefore/>
         <w:spacing w:after="180" w:before="360"/>
       </w:pPr>
+      <w:bookmarkStart w:name="sec_h1_1" w:id="100"/>
       <w:r>
         <w:t xml:space="preserve">1. Executive Summary</w:t>
       </w:r>
+      <w:bookmarkEnd w:id="100"/>
     </w:p>
     <w:p>
       <w:pPr>
@@ -575,9 +926,11 @@
         <w:pageBreakBefore/>
         <w:spacing w:after="180" w:before="360"/>
       </w:pPr>
+      <w:bookmarkStart w:name="sec_h1_2" w:id="101"/>
       <w:r>
         <w:t xml:space="preserve">2. Market and Competitive Landscape</w:t>
       </w:r>
+      <w:bookmarkEnd w:id="101"/>
     </w:p>
     <w:p>
       <w:pPr>
@@ -2133,9 +2486,11 @@
         <w:pageBreakBefore/>
         <w:spacing w:after="180" w:before="360"/>
       </w:pPr>
+      <w:bookmarkStart w:name="sec_h1_3" w:id="102"/>
       <w:r>
         <w:t xml:space="preserve">3. Where We Are Today</w:t>
       </w:r>
+      <w:bookmarkEnd w:id="102"/>
     </w:p>
     <w:p>
       <w:pPr>
@@ -3889,9 +4244,11 @@
         <w:pageBreakBefore/>
         <w:spacing w:after="180" w:before="360"/>
       </w:pPr>
+      <w:bookmarkStart w:name="sec_h1_4" w:id="103"/>
       <w:r>
         <w:t xml:space="preserve">4. Strategy and Positioning</w:t>
       </w:r>
+      <w:bookmarkEnd w:id="103"/>
     </w:p>
     <w:p>
       <w:pPr>
@@ -4684,9 +5041,11 @@
         <w:pageBreakBefore/>
         <w:spacing w:after="180" w:before="360"/>
       </w:pPr>
+      <w:bookmarkStart w:name="sec_h1_5" w:id="104"/>
       <w:r>
         <w:t xml:space="preserve">5. Five Revenue Lines</w:t>
       </w:r>
+      <w:bookmarkEnd w:id="104"/>
     </w:p>
     <w:p>
       <w:pPr>
@@ -7657,9 +8016,11 @@
         <w:pageBreakBefore/>
         <w:spacing w:after="180" w:before="360"/>
       </w:pPr>
+      <w:bookmarkStart w:name="sec_h1_6" w:id="105"/>
       <w:r>
         <w:t xml:space="preserve">6. Unit Economics</w:t>
       </w:r>
+      <w:bookmarkEnd w:id="105"/>
     </w:p>
     <w:p>
       <w:pPr>
@@ -9561,9 +9922,11 @@
         <w:pageBreakBefore/>
         <w:spacing w:after="180" w:before="360"/>
       </w:pPr>
+      <w:bookmarkStart w:name="sec_h1_7" w:id="106"/>
       <w:r>
         <w:t xml:space="preserve">7. Cashflow Scenarios</w:t>
       </w:r>
+      <w:bookmarkEnd w:id="106"/>
     </w:p>
     <w:p>
       <w:pPr>
@@ -10650,9 +11013,11 @@
         <w:pageBreakBefore/>
         <w:spacing w:after="180" w:before="360"/>
       </w:pPr>
+      <w:bookmarkStart w:name="sec_h1_8" w:id="107"/>
       <w:r>
         <w:t xml:space="preserve">8. Traffic and Audience Growth</w:t>
       </w:r>
+      <w:bookmarkEnd w:id="107"/>
     </w:p>
     <w:p>
       <w:pPr>
@@ -11704,9 +12069,11 @@
         <w:pageBreakBefore/>
         <w:spacing w:after="180" w:before="360"/>
       </w:pPr>
+      <w:bookmarkStart w:name="sec_h1_9" w:id="108"/>
       <w:r>
         <w:t xml:space="preserve">9. Operations</w:t>
       </w:r>
+      <w:bookmarkEnd w:id="108"/>
     </w:p>
     <w:p>
       <w:pPr>
@@ -15529,9 +15896,11 @@
         <w:pageBreakBefore/>
         <w:spacing w:after="180" w:before="360"/>
       </w:pPr>
+      <w:bookmarkStart w:name="sec_h1_10" w:id="109"/>
       <w:r>
         <w:t xml:space="preserve">10. SEO Infrastructure</w:t>
       </w:r>
+      <w:bookmarkEnd w:id="109"/>
     </w:p>
     <w:p>
       <w:pPr>
@@ -15948,9 +16317,11 @@
         <w:pageBreakBefore/>
         <w:spacing w:after="180" w:before="360"/>
       </w:pPr>
+      <w:bookmarkStart w:name="sec_h1_11" w:id="110"/>
       <w:r>
         <w:t xml:space="preserve">11. Distribution Channels</w:t>
       </w:r>
+      <w:bookmarkEnd w:id="110"/>
     </w:p>
     <w:p>
       <w:pPr>
@@ -16182,9 +16553,11 @@
         <w:pageBreakBefore/>
         <w:spacing w:after="180" w:before="360"/>
       </w:pPr>
+      <w:bookmarkStart w:name="sec_h1_12" w:id="111"/>
       <w:r>
         <w:t xml:space="preserve">12. Legal Structure, Compliance, and Insurance</w:t>
       </w:r>
+      <w:bookmarkEnd w:id="111"/>
     </w:p>
     <w:p>
       <w:pPr>
@@ -16996,9 +17369,11 @@
         <w:pageBreakBefore/>
         <w:spacing w:after="180" w:before="360"/>
       </w:pPr>
+      <w:bookmarkStart w:name="sec_h1_13" w:id="112"/>
       <w:r>
         <w:t xml:space="preserve">13. Parent Coach Approved (Brand Mark Spec)</w:t>
       </w:r>
+      <w:bookmarkEnd w:id="112"/>
     </w:p>
     <w:p>
       <w:pPr>
@@ -17855,9 +18230,11 @@
         <w:pageBreakBefore/>
         <w:spacing w:after="180" w:before="360"/>
       </w:pPr>
+      <w:bookmarkStart w:name="sec_h1_14" w:id="113"/>
       <w:r>
         <w:t xml:space="preserve">14. Milestone Gates</w:t>
       </w:r>
+      <w:bookmarkEnd w:id="113"/>
     </w:p>
     <w:p>
       <w:pPr>
@@ -18617,9 +18994,11 @@
         <w:pageBreakBefore/>
         <w:spacing w:after="180" w:before="360"/>
       </w:pPr>
+      <w:bookmarkStart w:name="sec_h1_15" w:id="114"/>
       <w:r>
         <w:t xml:space="preserve">15. KPIs to Watch</w:t>
       </w:r>
+      <w:bookmarkEnd w:id="114"/>
     </w:p>
     <w:p>
       <w:pPr>
@@ -19108,9 +19487,11 @@
         <w:pageBreakBefore/>
         <w:spacing w:after="180" w:before="360"/>
       </w:pPr>
+      <w:bookmarkStart w:name="sec_h1_16" w:id="115"/>
       <w:r>
         <w:t xml:space="preserve">16. Risks and Mitigations</w:t>
       </w:r>
+      <w:bookmarkEnd w:id="115"/>
     </w:p>
     <w:p>
       <w:pPr>
@@ -20117,9 +20498,11 @@
         <w:pageBreakBefore/>
         <w:spacing w:after="180" w:before="360"/>
       </w:pPr>
+      <w:bookmarkStart w:name="sec_h1_17" w:id="116"/>
       <w:r>
         <w:t xml:space="preserve">17. Quarter-by-Quarter Execution</w:t>
       </w:r>
+      <w:bookmarkEnd w:id="116"/>
     </w:p>
     <w:p>
       <w:pPr>
@@ -20807,9 +21190,11 @@
         <w:pageBreakBefore/>
         <w:spacing w:after="180" w:before="360"/>
       </w:pPr>
+      <w:bookmarkStart w:name="sec_h1_18" w:id="117"/>
       <w:r>
         <w:t xml:space="preserve">18. Exit and Asset Framing</w:t>
       </w:r>
+      <w:bookmarkEnd w:id="117"/>
     </w:p>
     <w:p>
       <w:pPr>
@@ -22047,9 +22432,11 @@
         <w:pageBreakBefore/>
         <w:spacing w:after="180" w:before="360"/>
       </w:pPr>
+      <w:bookmarkStart w:name="sec_h1_19" w:id="118"/>
       <w:r>
         <w:t xml:space="preserve">Appendix A: Financial Model Assumptions</w:t>
       </w:r>
+      <w:bookmarkEnd w:id="118"/>
     </w:p>
     <w:p>
       <w:pPr>

</xml_diff>